<commit_message>
Proje 3 - Adım 4: Kolon bazlı şifreleme (AES-256) başarıyla uygulandı
</commit_message>
<xml_diff>
--- a/BLM4522_Proje3/Rapor.docx
+++ b/BLM4522_Proje3/Rapor.docx
@@ -91,14 +91,7 @@
           <w:b/>
           <w:bCs/>
         </w:rPr>
-        <w:t xml:space="preserve">2.Adım: </w:t>
-      </w:r>
-      <w:r>
-        <w:rPr>
-          <w:b/>
-          <w:bCs/>
-        </w:rPr>
-        <w:t>Erişim Yönetimi (</w:t>
+        <w:t>2.Adım: Erişim Yönetimi (</w:t>
       </w:r>
       <w:proofErr w:type="spellStart"/>
       <w:r>
@@ -157,6 +150,9 @@
     <w:p/>
     <w:p>
       <w:r>
+        <w:rPr>
+          <w:noProof/>
+        </w:rPr>
         <w:drawing>
           <wp:inline distT="0" distB="0" distL="0" distR="0" wp14:anchorId="77F704A3" wp14:editId="298315AB">
             <wp:extent cx="3509181" cy="4274820"/>
@@ -212,14 +208,7 @@
           <w:b/>
           <w:bCs/>
         </w:rPr>
-        <w:t xml:space="preserve">3.Adım: </w:t>
-      </w:r>
-      <w:r>
-        <w:rPr>
-          <w:b/>
-          <w:bCs/>
-        </w:rPr>
-        <w:t>Yetkilendirme ve Kısıtlı Erişim (</w:t>
+        <w:t>3.Adım: Yetkilendirme ve Kısıtlı Erişim (</w:t>
       </w:r>
       <w:proofErr w:type="spellStart"/>
       <w:r>
@@ -313,6 +302,9 @@
         </w:rPr>
       </w:pPr>
       <w:r>
+        <w:rPr>
+          <w:noProof/>
+        </w:rPr>
         <w:drawing>
           <wp:inline distT="0" distB="0" distL="0" distR="0" wp14:anchorId="0600972B" wp14:editId="5FB3F767">
             <wp:extent cx="5105842" cy="6187976"/>
@@ -425,6 +417,9 @@
         <w:t>" hatası vererek erişimi durdurmuştur.</w:t>
       </w:r>
       <w:r>
+        <w:rPr>
+          <w:noProof/>
+        </w:rPr>
         <w:drawing>
           <wp:inline distT="0" distB="0" distL="0" distR="0" wp14:anchorId="4659C9C2" wp14:editId="07A1DC92">
             <wp:extent cx="5760720" cy="1309370"/>
@@ -500,6 +495,9 @@
     </w:p>
     <w:p>
       <w:r>
+        <w:rPr>
+          <w:noProof/>
+        </w:rPr>
         <w:drawing>
           <wp:inline distT="0" distB="0" distL="0" distR="0" wp14:anchorId="12BB1B00" wp14:editId="440AE9CE">
             <wp:extent cx="5760720" cy="1367790"/>
@@ -538,6 +536,182 @@
       </w:r>
     </w:p>
     <w:p/>
+    <w:p/>
+    <w:p/>
+    <w:p/>
+    <w:p/>
+    <w:p/>
+    <w:p/>
+    <w:p/>
+    <w:p/>
+    <w:p/>
+    <w:p/>
+    <w:p/>
+    <w:p/>
+    <w:p>
+      <w:r>
+        <w:lastRenderedPageBreak/>
+        <w:t>20.04.2026</w:t>
+      </w:r>
+    </w:p>
+    <w:p>
+      <w:pPr>
+        <w:rPr>
+          <w:b/>
+          <w:bCs/>
+        </w:rPr>
+      </w:pPr>
+      <w:r>
+        <w:rPr>
+          <w:b/>
+          <w:bCs/>
+        </w:rPr>
+        <w:t xml:space="preserve">4.Adım: </w:t>
+      </w:r>
+      <w:r>
+        <w:rPr>
+          <w:b/>
+          <w:bCs/>
+        </w:rPr>
+        <w:t>Veri Şifreleme (</w:t>
+      </w:r>
+      <w:proofErr w:type="gramStart"/>
+      <w:r>
+        <w:rPr>
+          <w:b/>
+          <w:bCs/>
+        </w:rPr>
+        <w:t>TDE -</w:t>
+      </w:r>
+      <w:proofErr w:type="gramEnd"/>
+      <w:r>
+        <w:rPr>
+          <w:b/>
+          <w:bCs/>
+        </w:rPr>
+        <w:t xml:space="preserve"> </w:t>
+      </w:r>
+      <w:proofErr w:type="spellStart"/>
+      <w:r>
+        <w:rPr>
+          <w:b/>
+          <w:bCs/>
+        </w:rPr>
+        <w:t>Transparent</w:t>
+      </w:r>
+      <w:proofErr w:type="spellEnd"/>
+      <w:r>
+        <w:rPr>
+          <w:b/>
+          <w:bCs/>
+        </w:rPr>
+        <w:t xml:space="preserve"> Data </w:t>
+      </w:r>
+      <w:proofErr w:type="spellStart"/>
+      <w:r>
+        <w:rPr>
+          <w:b/>
+          <w:bCs/>
+        </w:rPr>
+        <w:t>Encryption</w:t>
+      </w:r>
+      <w:proofErr w:type="spellEnd"/>
+      <w:r>
+        <w:rPr>
+          <w:b/>
+          <w:bCs/>
+        </w:rPr>
+        <w:t>)</w:t>
+      </w:r>
+    </w:p>
+    <w:p>
+      <w:r>
+        <w:t>S</w:t>
+      </w:r>
+      <w:r>
+        <w:t xml:space="preserve">QL Server Express Edition sürümünde TDE (Tüm </w:t>
+      </w:r>
+      <w:proofErr w:type="spellStart"/>
+      <w:r>
+        <w:t>veritabanı</w:t>
+      </w:r>
+      <w:proofErr w:type="spellEnd"/>
+      <w:r>
+        <w:t xml:space="preserve"> şifreleme) kısıtlaması bulunduğu için, hassas verilerin korunması amacıyla Kolon Bazlı Şifreleme (</w:t>
+      </w:r>
+      <w:proofErr w:type="spellStart"/>
+      <w:r>
+        <w:t>Column</w:t>
+      </w:r>
+      <w:proofErr w:type="spellEnd"/>
+      <w:r>
+        <w:t xml:space="preserve">-Level </w:t>
+      </w:r>
+      <w:proofErr w:type="spellStart"/>
+      <w:r>
+        <w:t>Encryption</w:t>
+      </w:r>
+      <w:proofErr w:type="spellEnd"/>
+      <w:r>
+        <w:t xml:space="preserve">) yöntemi uygulanmıştır. </w:t>
+      </w:r>
+      <w:proofErr w:type="gramStart"/>
+      <w:r>
+        <w:t>TC</w:t>
+      </w:r>
+      <w:proofErr w:type="gramEnd"/>
+      <w:r>
+        <w:t xml:space="preserve"> Kimlik bilgileri AES-256 algoritması ile disk üzerinde okunamaz hale getirilmiştir.</w:t>
+      </w:r>
+    </w:p>
+    <w:p>
+      <w:r>
+        <w:drawing>
+          <wp:inline distT="0" distB="0" distL="0" distR="0" wp14:anchorId="210B39B6" wp14:editId="779133AD">
+            <wp:extent cx="3741420" cy="3271569"/>
+            <wp:effectExtent l="0" t="0" r="0" b="5080"/>
+            <wp:docPr id="1755980660" name="Resim 1" descr="metin, ekran görüntüsü, sayı, numara, yazı tipi içeren bir resim&#10;&#10;Yapay zeka tarafından oluşturulmuş içerik yanlış olabilir."/>
+            <wp:cNvGraphicFramePr>
+              <a:graphicFrameLocks xmlns:a="http://schemas.openxmlformats.org/drawingml/2006/main" noChangeAspect="1"/>
+            </wp:cNvGraphicFramePr>
+            <a:graphic xmlns:a="http://schemas.openxmlformats.org/drawingml/2006/main">
+              <a:graphicData uri="http://schemas.openxmlformats.org/drawingml/2006/picture">
+                <pic:pic xmlns:pic="http://schemas.openxmlformats.org/drawingml/2006/picture">
+                  <pic:nvPicPr>
+                    <pic:cNvPr id="1755980660" name="Resim 1" descr="metin, ekran görüntüsü, sayı, numara, yazı tipi içeren bir resim&#10;&#10;Yapay zeka tarafından oluşturulmuş içerik yanlış olabilir."/>
+                    <pic:cNvPicPr/>
+                  </pic:nvPicPr>
+                  <pic:blipFill rotWithShape="1">
+                    <a:blip r:embed="rId9"/>
+                    <a:srcRect t="29057"/>
+                    <a:stretch>
+                      <a:fillRect/>
+                    </a:stretch>
+                  </pic:blipFill>
+                  <pic:spPr bwMode="auto">
+                    <a:xfrm>
+                      <a:off x="0" y="0"/>
+                      <a:ext cx="3748386" cy="3277660"/>
+                    </a:xfrm>
+                    <a:prstGeom prst="rect">
+                      <a:avLst/>
+                    </a:prstGeom>
+                    <a:ln>
+                      <a:noFill/>
+                    </a:ln>
+                    <a:extLst>
+                      <a:ext uri="{53640926-AAD7-44D8-BBD7-CCE9431645EC}">
+                        <a14:shadowObscured xmlns:a14="http://schemas.microsoft.com/office/drawing/2010/main"/>
+                      </a:ext>
+                    </a:extLst>
+                  </pic:spPr>
+                </pic:pic>
+              </a:graphicData>
+            </a:graphic>
+          </wp:inline>
+        </w:drawing>
+      </w:r>
+    </w:p>
     <w:sectPr>
       <w:pgSz w:w="11906" w:h="16838"/>
       <w:pgMar w:top="1417" w:right="1417" w:bottom="1417" w:left="1417" w:header="708" w:footer="708" w:gutter="0"/>

</xml_diff>

<commit_message>
Proje 3 - Adım 5: SQL Injection zafiyet testi ve parametreli sorgu çözümü eklendi
</commit_message>
<xml_diff>
--- a/BLM4522_Proje3/Rapor.docx
+++ b/BLM4522_Proje3/Rapor.docx
@@ -566,14 +566,7 @@
           <w:b/>
           <w:bCs/>
         </w:rPr>
-        <w:t xml:space="preserve">4.Adım: </w:t>
-      </w:r>
-      <w:r>
-        <w:rPr>
-          <w:b/>
-          <w:bCs/>
-        </w:rPr>
-        <w:t>Veri Şifreleme (</w:t>
+        <w:t>4.Adım: Veri Şifreleme (</w:t>
       </w:r>
       <w:proofErr w:type="gramStart"/>
       <w:r>
@@ -666,6 +659,9 @@
     </w:p>
     <w:p>
       <w:r>
+        <w:rPr>
+          <w:noProof/>
+        </w:rPr>
         <w:drawing>
           <wp:inline distT="0" distB="0" distL="0" distR="0" wp14:anchorId="210B39B6" wp14:editId="779133AD">
             <wp:extent cx="3741420" cy="3271569"/>
@@ -704,6 +700,117 @@
                         <a14:shadowObscured xmlns:a14="http://schemas.microsoft.com/office/drawing/2010/main"/>
                       </a:ext>
                     </a:extLst>
+                  </pic:spPr>
+                </pic:pic>
+              </a:graphicData>
+            </a:graphic>
+          </wp:inline>
+        </w:drawing>
+      </w:r>
+    </w:p>
+    <w:p/>
+    <w:p>
+      <w:r>
+        <w:t>20.04.2026</w:t>
+      </w:r>
+    </w:p>
+    <w:p>
+      <w:pPr>
+        <w:rPr>
+          <w:b/>
+          <w:bCs/>
+        </w:rPr>
+      </w:pPr>
+      <w:r>
+        <w:rPr>
+          <w:b/>
+          <w:bCs/>
+        </w:rPr>
+        <w:t xml:space="preserve">5. Adım: SQL </w:t>
+      </w:r>
+      <w:proofErr w:type="spellStart"/>
+      <w:r>
+        <w:rPr>
+          <w:b/>
+          <w:bCs/>
+        </w:rPr>
+        <w:t>Injection</w:t>
+      </w:r>
+      <w:proofErr w:type="spellEnd"/>
+      <w:r>
+        <w:rPr>
+          <w:b/>
+          <w:bCs/>
+        </w:rPr>
+        <w:t xml:space="preserve"> Testleri ve Korunma</w:t>
+      </w:r>
+    </w:p>
+    <w:p>
+      <w:r>
+        <w:t xml:space="preserve">Uygulama katmanından gelebilecek SQL </w:t>
+      </w:r>
+      <w:proofErr w:type="spellStart"/>
+      <w:r>
+        <w:t>Injection</w:t>
+      </w:r>
+      <w:proofErr w:type="spellEnd"/>
+      <w:r>
+        <w:t xml:space="preserve"> saldırılarına karşı </w:t>
+      </w:r>
+      <w:proofErr w:type="spellStart"/>
+      <w:r>
+        <w:t>veritabanının</w:t>
+      </w:r>
+      <w:proofErr w:type="spellEnd"/>
+      <w:r>
+        <w:t xml:space="preserve"> direnci test edilmiştir. Dinamik SQL yapısının ' OR 1=1 -- gibi girdilerle tüm verileri sızdırabildiği (Zafiyet anı) gözlemlenmiştir.</w:t>
+      </w:r>
+      <w:r>
+        <w:t xml:space="preserve"> </w:t>
+      </w:r>
+      <w:r>
+        <w:t>Bu açığı kapatmak için Parametreli Sorgu (</w:t>
+      </w:r>
+      <w:proofErr w:type="spellStart"/>
+      <w:r>
+        <w:t>Parameterized</w:t>
+      </w:r>
+      <w:proofErr w:type="spellEnd"/>
+      <w:r>
+        <w:t xml:space="preserve"> Query) yapısı kullanılmıştır.</w:t>
+      </w:r>
+    </w:p>
+    <w:p>
+      <w:r>
+        <w:drawing>
+          <wp:inline distT="0" distB="0" distL="0" distR="0" wp14:anchorId="58BABEDE" wp14:editId="21CEA637">
+            <wp:extent cx="4145639" cy="1402202"/>
+            <wp:effectExtent l="0" t="0" r="7620" b="7620"/>
+            <wp:docPr id="890868195" name="Resim 1" descr="metin, ekran görüntüsü, yazı tipi, yazılım içeren bir resim&#10;&#10;Yapay zeka tarafından oluşturulmuş içerik yanlış olabilir."/>
+            <wp:cNvGraphicFramePr>
+              <a:graphicFrameLocks xmlns:a="http://schemas.openxmlformats.org/drawingml/2006/main" noChangeAspect="1"/>
+            </wp:cNvGraphicFramePr>
+            <a:graphic xmlns:a="http://schemas.openxmlformats.org/drawingml/2006/main">
+              <a:graphicData uri="http://schemas.openxmlformats.org/drawingml/2006/picture">
+                <pic:pic xmlns:pic="http://schemas.openxmlformats.org/drawingml/2006/picture">
+                  <pic:nvPicPr>
+                    <pic:cNvPr id="890868195" name="Resim 1" descr="metin, ekran görüntüsü, yazı tipi, yazılım içeren bir resim&#10;&#10;Yapay zeka tarafından oluşturulmuş içerik yanlış olabilir."/>
+                    <pic:cNvPicPr/>
+                  </pic:nvPicPr>
+                  <pic:blipFill>
+                    <a:blip r:embed="rId10"/>
+                    <a:stretch>
+                      <a:fillRect/>
+                    </a:stretch>
+                  </pic:blipFill>
+                  <pic:spPr>
+                    <a:xfrm>
+                      <a:off x="0" y="0"/>
+                      <a:ext cx="4145639" cy="1402202"/>
+                    </a:xfrm>
+                    <a:prstGeom prst="rect">
+                      <a:avLst/>
+                    </a:prstGeom>
                   </pic:spPr>
                 </pic:pic>
               </a:graphicData>

</xml_diff>

<commit_message>
Proje 3 - Adım 6: Audit Log (Application Log) yapılandırıldı. Proje başarıyla tamamlandı.
</commit_message>
<xml_diff>
--- a/BLM4522_Proje3/Rapor.docx
+++ b/BLM4522_Proje3/Rapor.docx
@@ -41,15 +41,7 @@
     </w:p>
     <w:p>
       <w:r>
-        <w:t xml:space="preserve">Proje testlerinde kullanılmak üzere, yapay </w:t>
-      </w:r>
-      <w:proofErr w:type="gramStart"/>
-      <w:r>
-        <w:t>zeka</w:t>
-      </w:r>
-      <w:proofErr w:type="gramEnd"/>
-      <w:r>
-        <w:t xml:space="preserve"> desteğiyle hazırlanan T-SQL </w:t>
+        <w:t xml:space="preserve">Proje testlerinde kullanılmak üzere, yapay zeka desteğiyle hazırlanan T-SQL </w:t>
       </w:r>
       <w:proofErr w:type="spellStart"/>
       <w:r>
@@ -57,15 +49,7 @@
       </w:r>
       <w:proofErr w:type="spellEnd"/>
       <w:r>
-        <w:t xml:space="preserve"> aracılığıyla 100 satırlık dinamik ve sentetik bir veri seti oluşturulmuştur. Bu yöntemle, </w:t>
-      </w:r>
-      <w:proofErr w:type="gramStart"/>
-      <w:r>
-        <w:t>TC</w:t>
-      </w:r>
-      <w:proofErr w:type="gramEnd"/>
-      <w:r>
-        <w:t xml:space="preserve"> Kimlik ve Maaş gibi hassas veriler üzerinde gerçekçi güvenlik senaryoları simüle edilmiştir.</w:t>
+        <w:t xml:space="preserve"> aracılığıyla 100 satırlık dinamik ve sentetik bir veri seti oluşturulmuştur. Bu yöntemle, TC Kimlik ve Maaş gibi hassas veriler üzerinde gerçekçi güvenlik senaryoları simüle edilmiştir.</w:t>
       </w:r>
     </w:p>
     <w:p/>
@@ -264,7 +248,6 @@
         </w:rPr>
       </w:pPr>
       <w:proofErr w:type="spellStart"/>
-      <w:proofErr w:type="gramStart"/>
       <w:r>
         <w:rPr>
           <w:b/>
@@ -280,7 +263,6 @@
         <w:t>Yetkili</w:t>
       </w:r>
       <w:proofErr w:type="spellEnd"/>
-      <w:proofErr w:type="gramEnd"/>
       <w:r>
         <w:rPr>
           <w:b/>
@@ -384,15 +366,7 @@
     </w:p>
     <w:p>
       <w:r>
-        <w:t xml:space="preserve">Kullanıcının personel maaşları ve </w:t>
-      </w:r>
-      <w:proofErr w:type="gramStart"/>
-      <w:r>
-        <w:t>TC</w:t>
-      </w:r>
-      <w:proofErr w:type="gramEnd"/>
-      <w:r>
-        <w:t xml:space="preserve"> kimlik numaraları gibi kritik verilere erişimi engellenmiştir.</w:t>
+        <w:t>Kullanıcının personel maaşları ve TC kimlik numaraları gibi kritik verilere erişimi engellenmiştir.</w:t>
       </w:r>
       <w:r>
         <w:t xml:space="preserve"> S</w:t>
@@ -566,23 +540,7 @@
           <w:b/>
           <w:bCs/>
         </w:rPr>
-        <w:t>4.Adım: Veri Şifreleme (</w:t>
-      </w:r>
-      <w:proofErr w:type="gramStart"/>
-      <w:r>
-        <w:rPr>
-          <w:b/>
-          <w:bCs/>
-        </w:rPr>
-        <w:t>TDE -</w:t>
-      </w:r>
-      <w:proofErr w:type="gramEnd"/>
-      <w:r>
-        <w:rPr>
-          <w:b/>
-          <w:bCs/>
-        </w:rPr>
-        <w:t xml:space="preserve"> </w:t>
+        <w:t xml:space="preserve">4.Adım: Veri Şifreleme (TDE - </w:t>
       </w:r>
       <w:proofErr w:type="spellStart"/>
       <w:r>
@@ -646,15 +604,7 @@
       </w:r>
       <w:proofErr w:type="spellEnd"/>
       <w:r>
-        <w:t xml:space="preserve">) yöntemi uygulanmıştır. </w:t>
-      </w:r>
-      <w:proofErr w:type="gramStart"/>
-      <w:r>
-        <w:t>TC</w:t>
-      </w:r>
-      <w:proofErr w:type="gramEnd"/>
-      <w:r>
-        <w:t xml:space="preserve"> Kimlik bilgileri AES-256 algoritması ile disk üzerinde okunamaz hale getirilmiştir.</w:t>
+        <w:t>) yöntemi uygulanmıştır. TC Kimlik bilgileri AES-256 algoritması ile disk üzerinde okunamaz hale getirilmiştir.</w:t>
       </w:r>
     </w:p>
     <w:p>
@@ -807,6 +757,117 @@
                     <a:xfrm>
                       <a:off x="0" y="0"/>
                       <a:ext cx="4145639" cy="1402202"/>
+                    </a:xfrm>
+                    <a:prstGeom prst="rect">
+                      <a:avLst/>
+                    </a:prstGeom>
+                  </pic:spPr>
+                </pic:pic>
+              </a:graphicData>
+            </a:graphic>
+          </wp:inline>
+        </w:drawing>
+      </w:r>
+    </w:p>
+    <w:p/>
+    <w:p>
+      <w:r>
+        <w:lastRenderedPageBreak/>
+        <w:t>20.04.2026</w:t>
+      </w:r>
+    </w:p>
+    <w:p>
+      <w:pPr>
+        <w:rPr>
+          <w:b/>
+          <w:bCs/>
+        </w:rPr>
+      </w:pPr>
+      <w:r>
+        <w:rPr>
+          <w:b/>
+          <w:bCs/>
+        </w:rPr>
+        <w:t xml:space="preserve">6. Adım: </w:t>
+      </w:r>
+      <w:proofErr w:type="spellStart"/>
+      <w:r>
+        <w:rPr>
+          <w:b/>
+          <w:bCs/>
+        </w:rPr>
+        <w:t>Audit</w:t>
+      </w:r>
+      <w:proofErr w:type="spellEnd"/>
+      <w:r>
+        <w:rPr>
+          <w:b/>
+          <w:bCs/>
+        </w:rPr>
+        <w:t xml:space="preserve"> Log (Kullanıcı Aktivite Takibi)</w:t>
+      </w:r>
+    </w:p>
+    <w:p>
+      <w:proofErr w:type="spellStart"/>
+      <w:r>
+        <w:t>sys.xp_readerrorlog</w:t>
+      </w:r>
+      <w:proofErr w:type="spellEnd"/>
+      <w:r>
+        <w:t xml:space="preserve"> komutu ile sistem günlükleri taranmış ve </w:t>
+      </w:r>
+      <w:proofErr w:type="spellStart"/>
+      <w:r>
+        <w:t>Kullanici_Denetimi</w:t>
+      </w:r>
+      <w:proofErr w:type="spellEnd"/>
+      <w:r>
+        <w:t xml:space="preserve"> (ID: 65538) adlı </w:t>
+      </w:r>
+      <w:proofErr w:type="spellStart"/>
+      <w:r>
+        <w:t>audit</w:t>
+      </w:r>
+      <w:proofErr w:type="spellEnd"/>
+      <w:r>
+        <w:t xml:space="preserve"> nesnesinin başarıyla başlatıldığı, ilgili </w:t>
+      </w:r>
+      <w:proofErr w:type="spellStart"/>
+      <w:r>
+        <w:t>veritabanına</w:t>
+      </w:r>
+      <w:proofErr w:type="spellEnd"/>
+      <w:r>
+        <w:t xml:space="preserve"> atandığı ve çalışma zamanı boyunca olayları takip ettiği belgelenmiştir.</w:t>
+      </w:r>
+    </w:p>
+    <w:p>
+      <w:r>
+        <w:drawing>
+          <wp:inline distT="0" distB="0" distL="0" distR="0" wp14:anchorId="7ED7E2E3" wp14:editId="0D7254C4">
+            <wp:extent cx="4823878" cy="4778154"/>
+            <wp:effectExtent l="0" t="0" r="0" b="3810"/>
+            <wp:docPr id="388127522" name="Resim 1" descr="metin, yazı tipi, ekran görüntüsü, sayı, numara içeren bir resim&#10;&#10;Yapay zeka tarafından oluşturulmuş içerik yanlış olabilir."/>
+            <wp:cNvGraphicFramePr>
+              <a:graphicFrameLocks xmlns:a="http://schemas.openxmlformats.org/drawingml/2006/main" noChangeAspect="1"/>
+            </wp:cNvGraphicFramePr>
+            <a:graphic xmlns:a="http://schemas.openxmlformats.org/drawingml/2006/main">
+              <a:graphicData uri="http://schemas.openxmlformats.org/drawingml/2006/picture">
+                <pic:pic xmlns:pic="http://schemas.openxmlformats.org/drawingml/2006/picture">
+                  <pic:nvPicPr>
+                    <pic:cNvPr id="388127522" name="Resim 1" descr="metin, yazı tipi, ekran görüntüsü, sayı, numara içeren bir resim&#10;&#10;Yapay zeka tarafından oluşturulmuş içerik yanlış olabilir."/>
+                    <pic:cNvPicPr/>
+                  </pic:nvPicPr>
+                  <pic:blipFill>
+                    <a:blip r:embed="rId11"/>
+                    <a:stretch>
+                      <a:fillRect/>
+                    </a:stretch>
+                  </pic:blipFill>
+                  <pic:spPr>
+                    <a:xfrm>
+                      <a:off x="0" y="0"/>
+                      <a:ext cx="4823878" cy="4778154"/>
                     </a:xfrm>
                     <a:prstGeom prst="rect">
                       <a:avLst/>

</xml_diff>

<commit_message>
Proje 3: Kapak sayfası eklendi ve tüm güvenlik adımları belgelendi
</commit_message>
<xml_diff>
--- a/BLM4522_Proje3/Rapor.docx
+++ b/BLM4522_Proje3/Rapor.docx
@@ -4,24 +4,453 @@
   <w:body>
     <w:p>
       <w:pPr>
+        <w:spacing w:after="0" w:line="360" w:lineRule="auto"/>
+        <w:jc w:val="center"/>
+        <w:rPr>
+          <w:rFonts w:cs="Arial"/>
+          <w:b/>
+          <w:sz w:val="28"/>
+          <w:szCs w:val="28"/>
+        </w:rPr>
+      </w:pPr>
+      <w:bookmarkStart w:id="0" w:name="_Hlk227583312"/>
+      <w:r>
+        <w:rPr>
+          <w:rFonts w:cs="Arial"/>
+          <w:b/>
+          <w:sz w:val="28"/>
+          <w:szCs w:val="28"/>
+        </w:rPr>
+        <w:t xml:space="preserve">ANKARA ÜNİVERSİTESİ </w:t>
+      </w:r>
+    </w:p>
+    <w:p>
+      <w:pPr>
+        <w:spacing w:after="0" w:line="360" w:lineRule="auto"/>
+        <w:jc w:val="center"/>
+        <w:rPr>
+          <w:rFonts w:cs="Arial"/>
+          <w:b/>
+          <w:sz w:val="28"/>
+          <w:szCs w:val="28"/>
+        </w:rPr>
+      </w:pPr>
+      <w:r>
+        <w:rPr>
+          <w:rFonts w:cs="Arial"/>
+          <w:b/>
+          <w:sz w:val="28"/>
+          <w:szCs w:val="28"/>
+        </w:rPr>
+        <w:t xml:space="preserve">MÜHENDİSLİK FAKÜLTESİ </w:t>
+      </w:r>
+    </w:p>
+    <w:p>
+      <w:pPr>
+        <w:spacing w:after="360" w:line="360" w:lineRule="auto"/>
+        <w:jc w:val="center"/>
+        <w:rPr>
+          <w:rFonts w:cs="Arial"/>
+          <w:b/>
+          <w:sz w:val="28"/>
+          <w:szCs w:val="28"/>
+        </w:rPr>
+      </w:pPr>
+      <w:r>
+        <w:rPr>
+          <w:rFonts w:cs="Arial"/>
+          <w:b/>
+          <w:sz w:val="28"/>
+          <w:szCs w:val="28"/>
+        </w:rPr>
+        <w:t xml:space="preserve">BİLGİSAYAR MÜHENDİSLİĞİ BÖLÜMÜ </w:t>
+      </w:r>
+    </w:p>
+    <w:p>
+      <w:pPr>
+        <w:spacing w:after="360" w:line="360" w:lineRule="auto"/>
+        <w:jc w:val="center"/>
+        <w:rPr>
+          <w:rFonts w:cs="Arial"/>
+          <w:b/>
+          <w:sz w:val="28"/>
+          <w:szCs w:val="28"/>
+        </w:rPr>
+      </w:pPr>
+      <w:r>
+        <w:rPr>
+          <w:rFonts w:cs="Arial"/>
+          <w:b/>
+          <w:noProof/>
+          <w:sz w:val="28"/>
+          <w:szCs w:val="28"/>
+        </w:rPr>
+        <w:drawing>
+          <wp:inline distT="0" distB="0" distL="0" distR="0" wp14:anchorId="65DDCF1A" wp14:editId="349B16D5">
+            <wp:extent cx="1800225" cy="1800225"/>
+            <wp:effectExtent l="19050" t="0" r="9525" b="0"/>
+            <wp:docPr id="1" name="Resim 1" descr="amblem, daire, logo, simge, sembol içeren bir resim&#10;&#10;Yapay zeka tarafından oluşturulmuş içerik yanlış olabilir."/>
+            <wp:cNvGraphicFramePr>
+              <a:graphicFrameLocks xmlns:a="http://schemas.openxmlformats.org/drawingml/2006/main" noChangeAspect="1"/>
+            </wp:cNvGraphicFramePr>
+            <a:graphic xmlns:a="http://schemas.openxmlformats.org/drawingml/2006/main">
+              <a:graphicData uri="http://schemas.openxmlformats.org/drawingml/2006/picture">
+                <pic:pic xmlns:pic="http://schemas.openxmlformats.org/drawingml/2006/picture">
+                  <pic:nvPicPr>
+                    <pic:cNvPr id="1" name="Resim 1" descr="amblem, daire, logo, simge, sembol içeren bir resim&#10;&#10;Yapay zeka tarafından oluşturulmuş içerik yanlış olabilir."/>
+                    <pic:cNvPicPr>
+                      <a:picLocks noChangeAspect="1" noChangeArrowheads="1"/>
+                    </pic:cNvPicPr>
+                  </pic:nvPicPr>
+                  <pic:blipFill>
+                    <a:blip r:embed="rId5" cstate="print"/>
+                    <a:srcRect/>
+                    <a:stretch>
+                      <a:fillRect/>
+                    </a:stretch>
+                  </pic:blipFill>
+                  <pic:spPr bwMode="auto">
+                    <a:xfrm>
+                      <a:off x="0" y="0"/>
+                      <a:ext cx="1800225" cy="1800225"/>
+                    </a:xfrm>
+                    <a:prstGeom prst="rect">
+                      <a:avLst/>
+                    </a:prstGeom>
+                    <a:noFill/>
+                    <a:ln w="9525">
+                      <a:noFill/>
+                      <a:miter lim="800000"/>
+                      <a:headEnd/>
+                      <a:tailEnd/>
+                    </a:ln>
+                  </pic:spPr>
+                </pic:pic>
+              </a:graphicData>
+            </a:graphic>
+          </wp:inline>
+        </w:drawing>
+      </w:r>
+    </w:p>
+    <w:p>
+      <w:pPr>
+        <w:spacing w:after="360" w:line="360" w:lineRule="auto"/>
+        <w:jc w:val="center"/>
+        <w:rPr>
+          <w:rFonts w:cs="Arial"/>
+          <w:b/>
+          <w:sz w:val="28"/>
+          <w:szCs w:val="28"/>
+        </w:rPr>
+      </w:pPr>
+    </w:p>
+    <w:p>
+      <w:pPr>
+        <w:spacing w:after="360" w:line="360" w:lineRule="auto"/>
+        <w:jc w:val="center"/>
+        <w:rPr>
+          <w:rFonts w:cs="Arial"/>
+          <w:b/>
+          <w:bCs/>
+          <w:sz w:val="28"/>
+          <w:szCs w:val="28"/>
+        </w:rPr>
+      </w:pPr>
+      <w:r>
+        <w:rPr>
+          <w:rFonts w:cs="Arial"/>
+          <w:b/>
+          <w:bCs/>
+          <w:sz w:val="28"/>
+          <w:szCs w:val="28"/>
+        </w:rPr>
+        <w:t xml:space="preserve">BLM 4522 – Proje 3: </w:t>
+      </w:r>
+      <w:proofErr w:type="spellStart"/>
+      <w:r>
+        <w:rPr>
+          <w:rFonts w:cs="Arial"/>
+          <w:b/>
+          <w:bCs/>
+          <w:sz w:val="28"/>
+          <w:szCs w:val="28"/>
+        </w:rPr>
+        <w:t>V</w:t>
+      </w:r>
+      <w:r>
+        <w:rPr>
+          <w:rFonts w:cs="Arial"/>
+          <w:b/>
+          <w:bCs/>
+          <w:sz w:val="28"/>
+          <w:szCs w:val="28"/>
+        </w:rPr>
+        <w:t>eritabanı</w:t>
+      </w:r>
+      <w:proofErr w:type="spellEnd"/>
+      <w:r>
+        <w:rPr>
+          <w:rFonts w:cs="Arial"/>
+          <w:b/>
+          <w:bCs/>
+          <w:sz w:val="28"/>
+          <w:szCs w:val="28"/>
+        </w:rPr>
+        <w:t xml:space="preserve"> Güvenliği</w:t>
+      </w:r>
+    </w:p>
+    <w:p>
+      <w:pPr>
+        <w:spacing w:after="360" w:line="360" w:lineRule="auto"/>
+        <w:jc w:val="center"/>
+        <w:rPr>
+          <w:rFonts w:cs="Arial"/>
+          <w:b/>
+          <w:bCs/>
+          <w:sz w:val="28"/>
+          <w:szCs w:val="28"/>
+        </w:rPr>
+      </w:pPr>
+      <w:r>
+        <w:rPr>
+          <w:rFonts w:cs="Arial"/>
+          <w:b/>
+          <w:bCs/>
+          <w:sz w:val="28"/>
+          <w:szCs w:val="28"/>
+        </w:rPr>
+        <w:t xml:space="preserve"> </w:t>
+      </w:r>
+      <w:proofErr w:type="gramStart"/>
+      <w:r>
+        <w:rPr>
+          <w:rFonts w:cs="Arial"/>
+          <w:b/>
+          <w:bCs/>
+          <w:sz w:val="28"/>
+          <w:szCs w:val="28"/>
+        </w:rPr>
+        <w:t>ve</w:t>
+      </w:r>
+      <w:proofErr w:type="gramEnd"/>
+      <w:r>
+        <w:rPr>
+          <w:rFonts w:cs="Arial"/>
+          <w:b/>
+          <w:bCs/>
+          <w:sz w:val="28"/>
+          <w:szCs w:val="28"/>
+        </w:rPr>
+        <w:t xml:space="preserve"> Erişim Kontrolü</w:t>
+      </w:r>
+      <w:r>
+        <w:rPr>
+          <w:rFonts w:cs="Arial"/>
+          <w:b/>
+          <w:bCs/>
+          <w:sz w:val="28"/>
+          <w:szCs w:val="28"/>
+        </w:rPr>
+        <w:t xml:space="preserve"> Raporu</w:t>
+      </w:r>
+    </w:p>
+    <w:p>
+      <w:pPr>
+        <w:spacing w:after="360" w:line="360" w:lineRule="auto"/>
+        <w:jc w:val="center"/>
+        <w:rPr>
+          <w:rFonts w:cs="Arial"/>
+          <w:b/>
+          <w:color w:val="000000" w:themeColor="text1"/>
+        </w:rPr>
+      </w:pPr>
+      <w:r>
+        <w:rPr>
+          <w:rFonts w:cs="Arial"/>
+          <w:b/>
+          <w:color w:val="000000" w:themeColor="text1"/>
+        </w:rPr>
+        <w:t xml:space="preserve">Senem Arıcı </w:t>
+      </w:r>
+    </w:p>
+    <w:p>
+      <w:pPr>
+        <w:spacing w:after="360" w:line="360" w:lineRule="auto"/>
+        <w:jc w:val="center"/>
+        <w:rPr>
+          <w:rFonts w:cs="Arial"/>
+          <w:b/>
+          <w:color w:val="000000" w:themeColor="text1"/>
+        </w:rPr>
+      </w:pPr>
+      <w:r>
+        <w:rPr>
+          <w:rFonts w:cs="Arial"/>
+          <w:b/>
+          <w:color w:val="000000" w:themeColor="text1"/>
+        </w:rPr>
+        <w:t>22290619</w:t>
+      </w:r>
+    </w:p>
+    <w:p>
+      <w:pPr>
+        <w:spacing w:after="360" w:line="360" w:lineRule="auto"/>
+        <w:jc w:val="center"/>
+        <w:rPr>
+          <w:rFonts w:cs="Arial"/>
+          <w:b/>
+          <w:color w:val="000000" w:themeColor="text1"/>
+        </w:rPr>
+      </w:pPr>
+      <w:r>
+        <w:rPr>
+          <w:rFonts w:cs="Arial"/>
+          <w:b/>
+          <w:color w:val="000000" w:themeColor="text1"/>
+        </w:rPr>
+        <w:t>20.04</w:t>
+      </w:r>
+      <w:r>
+        <w:rPr>
+          <w:rFonts w:cs="Arial"/>
+          <w:b/>
+          <w:color w:val="000000" w:themeColor="text1"/>
+        </w:rPr>
+        <w:t xml:space="preserve">.2026 </w:t>
+      </w:r>
+    </w:p>
+    <w:p>
+      <w:pPr>
         <w:pStyle w:val="Balk1"/>
         <w:jc w:val="center"/>
       </w:pPr>
       <w:r>
+        <w:rPr>
+          <w:rFonts w:asciiTheme="minorHAnsi" w:eastAsiaTheme="minorHAnsi" w:hAnsiTheme="minorHAnsi" w:cs="Arial"/>
+          <w:b/>
+          <w:color w:val="auto"/>
+          <w:sz w:val="24"/>
+          <w:szCs w:val="24"/>
+        </w:rPr>
+        <w:t>https://github.com/senemarici/BLM4522--</w:t>
+      </w:r>
+      <w:proofErr w:type="spellStart"/>
+      <w:r>
+        <w:rPr>
+          <w:rFonts w:asciiTheme="minorHAnsi" w:eastAsiaTheme="minorHAnsi" w:hAnsiTheme="minorHAnsi" w:cs="Arial"/>
+          <w:b/>
+          <w:color w:val="auto"/>
+          <w:sz w:val="24"/>
+          <w:szCs w:val="24"/>
+        </w:rPr>
+        <w:t>Ag</w:t>
+      </w:r>
+      <w:proofErr w:type="spellEnd"/>
+      <w:r>
+        <w:rPr>
+          <w:rFonts w:asciiTheme="minorHAnsi" w:eastAsiaTheme="minorHAnsi" w:hAnsiTheme="minorHAnsi" w:cs="Arial"/>
+          <w:b/>
+          <w:color w:val="auto"/>
+          <w:sz w:val="24"/>
+          <w:szCs w:val="24"/>
+        </w:rPr>
+        <w:t>-</w:t>
+      </w:r>
+      <w:proofErr w:type="spellStart"/>
+      <w:r>
+        <w:rPr>
+          <w:rFonts w:asciiTheme="minorHAnsi" w:eastAsiaTheme="minorHAnsi" w:hAnsiTheme="minorHAnsi" w:cs="Arial"/>
+          <w:b/>
+          <w:color w:val="auto"/>
+          <w:sz w:val="24"/>
+          <w:szCs w:val="24"/>
+        </w:rPr>
+        <w:t>Tabanli</w:t>
+      </w:r>
+      <w:proofErr w:type="spellEnd"/>
+      <w:r>
+        <w:rPr>
+          <w:rFonts w:asciiTheme="minorHAnsi" w:eastAsiaTheme="minorHAnsi" w:hAnsiTheme="minorHAnsi" w:cs="Arial"/>
+          <w:b/>
+          <w:color w:val="auto"/>
+          <w:sz w:val="24"/>
+          <w:szCs w:val="24"/>
+        </w:rPr>
+        <w:t>-Paralel-</w:t>
+      </w:r>
+      <w:proofErr w:type="spellStart"/>
+      <w:r>
+        <w:rPr>
+          <w:rFonts w:asciiTheme="minorHAnsi" w:eastAsiaTheme="minorHAnsi" w:hAnsiTheme="minorHAnsi" w:cs="Arial"/>
+          <w:b/>
+          <w:color w:val="auto"/>
+          <w:sz w:val="24"/>
+          <w:szCs w:val="24"/>
+        </w:rPr>
+        <w:t>Dagitim</w:t>
+      </w:r>
+      <w:proofErr w:type="spellEnd"/>
+      <w:r>
+        <w:rPr>
+          <w:rFonts w:asciiTheme="minorHAnsi" w:eastAsiaTheme="minorHAnsi" w:hAnsiTheme="minorHAnsi" w:cs="Arial"/>
+          <w:b/>
+          <w:color w:val="auto"/>
+          <w:sz w:val="24"/>
+          <w:szCs w:val="24"/>
+        </w:rPr>
+        <w:t>-Sistemleri-Projeleri</w:t>
+      </w:r>
+    </w:p>
+    <w:bookmarkEnd w:id="0"/>
+    <w:p/>
+    <w:p/>
+    <w:p/>
+    <w:p/>
+    <w:p>
+      <w:pPr>
+        <w:pStyle w:val="Balk1"/>
+        <w:jc w:val="center"/>
+        <w:rPr>
+          <w:b/>
+          <w:bCs/>
+          <w:color w:val="000000" w:themeColor="text1"/>
+        </w:rPr>
+      </w:pPr>
+      <w:r>
+        <w:rPr>
+          <w:b/>
+          <w:bCs/>
+          <w:color w:val="000000" w:themeColor="text1"/>
+        </w:rPr>
+        <w:lastRenderedPageBreak/>
         <w:t xml:space="preserve">Proje 3: </w:t>
       </w:r>
       <w:proofErr w:type="spellStart"/>
       <w:r>
+        <w:rPr>
+          <w:b/>
+          <w:bCs/>
+          <w:color w:val="000000" w:themeColor="text1"/>
+        </w:rPr>
         <w:t>Veritabanı</w:t>
       </w:r>
       <w:proofErr w:type="spellEnd"/>
       <w:r>
+        <w:rPr>
+          <w:b/>
+          <w:bCs/>
+          <w:color w:val="000000" w:themeColor="text1"/>
+        </w:rPr>
         <w:t xml:space="preserve"> Güvenliği ve Erişim Kontrolü</w:t>
       </w:r>
     </w:p>
-    <w:p>
-      <w:r>
-        <w:t>06.04.2025</w:t>
+    <w:p/>
+    <w:p>
+      <w:r>
+        <w:t>06.04.202</w:t>
+      </w:r>
+      <w:r>
+        <w:t>6</w:t>
       </w:r>
     </w:p>
     <w:p>
@@ -41,7 +470,15 @@
     </w:p>
     <w:p>
       <w:r>
-        <w:t xml:space="preserve">Proje testlerinde kullanılmak üzere, yapay zeka desteğiyle hazırlanan T-SQL </w:t>
+        <w:t xml:space="preserve">Proje testlerinde kullanılmak üzere, yapay </w:t>
+      </w:r>
+      <w:proofErr w:type="gramStart"/>
+      <w:r>
+        <w:t>zeka</w:t>
+      </w:r>
+      <w:proofErr w:type="gramEnd"/>
+      <w:r>
+        <w:t xml:space="preserve"> desteğiyle hazırlanan T-SQL </w:t>
       </w:r>
       <w:proofErr w:type="spellStart"/>
       <w:r>
@@ -49,7 +486,15 @@
       </w:r>
       <w:proofErr w:type="spellEnd"/>
       <w:r>
-        <w:t xml:space="preserve"> aracılığıyla 100 satırlık dinamik ve sentetik bir veri seti oluşturulmuştur. Bu yöntemle, TC Kimlik ve Maaş gibi hassas veriler üzerinde gerçekçi güvenlik senaryoları simüle edilmiştir.</w:t>
+        <w:t xml:space="preserve"> aracılığıyla 100 satırlık dinamik ve sentetik bir veri seti oluşturulmuştur. Bu yöntemle, </w:t>
+      </w:r>
+      <w:proofErr w:type="gramStart"/>
+      <w:r>
+        <w:t>TC</w:t>
+      </w:r>
+      <w:proofErr w:type="gramEnd"/>
+      <w:r>
+        <w:t xml:space="preserve"> Kimlik ve Maaş gibi hassas veriler üzerinde gerçekçi güvenlik senaryoları simüle edilmiştir.</w:t>
       </w:r>
     </w:p>
     <w:p/>
@@ -138,9 +583,9 @@
           <w:noProof/>
         </w:rPr>
         <w:drawing>
-          <wp:inline distT="0" distB="0" distL="0" distR="0" wp14:anchorId="77F704A3" wp14:editId="298315AB">
-            <wp:extent cx="3509181" cy="4274820"/>
-            <wp:effectExtent l="0" t="0" r="0" b="0"/>
+          <wp:inline distT="0" distB="0" distL="0" distR="0" wp14:anchorId="77F704A3" wp14:editId="149AC9DE">
+            <wp:extent cx="3200400" cy="3898669"/>
+            <wp:effectExtent l="0" t="0" r="0" b="6985"/>
             <wp:docPr id="254352671" name="Resim 1" descr="metin, ekran görüntüsü, yazılım, sayı, numara içeren bir resim&#10;&#10;Yapay zeka tarafından oluşturulmuş içerik yanlış olabilir."/>
             <wp:cNvGraphicFramePr>
               <a:graphicFrameLocks xmlns:a="http://schemas.openxmlformats.org/drawingml/2006/main" noChangeAspect="1"/>
@@ -153,7 +598,7 @@
                     <pic:cNvPicPr/>
                   </pic:nvPicPr>
                   <pic:blipFill>
-                    <a:blip r:embed="rId5"/>
+                    <a:blip r:embed="rId6"/>
                     <a:stretch>
                       <a:fillRect/>
                     </a:stretch>
@@ -161,7 +606,7 @@
                   <pic:spPr>
                     <a:xfrm>
                       <a:off x="0" y="0"/>
-                      <a:ext cx="3510895" cy="4276908"/>
+                      <a:ext cx="3203100" cy="3901958"/>
                     </a:xfrm>
                     <a:prstGeom prst="rect">
                       <a:avLst/>
@@ -174,6 +619,7 @@
         </w:drawing>
       </w:r>
     </w:p>
+    <w:p/>
     <w:p>
       <w:r>
         <w:lastRenderedPageBreak/>
@@ -248,6 +694,7 @@
         </w:rPr>
       </w:pPr>
       <w:proofErr w:type="spellStart"/>
+      <w:proofErr w:type="gramStart"/>
       <w:r>
         <w:rPr>
           <w:b/>
@@ -263,6 +710,7 @@
         <w:t>Yetkili</w:t>
       </w:r>
       <w:proofErr w:type="spellEnd"/>
+      <w:proofErr w:type="gramEnd"/>
       <w:r>
         <w:rPr>
           <w:b/>
@@ -303,7 +751,7 @@
                     <pic:cNvPicPr/>
                   </pic:nvPicPr>
                   <pic:blipFill>
-                    <a:blip r:embed="rId6"/>
+                    <a:blip r:embed="rId7"/>
                     <a:stretch>
                       <a:fillRect/>
                     </a:stretch>
@@ -366,7 +814,15 @@
     </w:p>
     <w:p>
       <w:r>
-        <w:t>Kullanıcının personel maaşları ve TC kimlik numaraları gibi kritik verilere erişimi engellenmiştir.</w:t>
+        <w:t xml:space="preserve">Kullanıcının personel maaşları ve </w:t>
+      </w:r>
+      <w:proofErr w:type="gramStart"/>
+      <w:r>
+        <w:t>TC</w:t>
+      </w:r>
+      <w:proofErr w:type="gramEnd"/>
+      <w:r>
+        <w:t xml:space="preserve"> kimlik numaraları gibi kritik verilere erişimi engellenmiştir.</w:t>
       </w:r>
       <w:r>
         <w:t xml:space="preserve"> S</w:t>
@@ -410,7 +866,7 @@
                     <pic:cNvPicPr/>
                   </pic:nvPicPr>
                   <pic:blipFill>
-                    <a:blip r:embed="rId7"/>
+                    <a:blip r:embed="rId8"/>
                     <a:stretch>
                       <a:fillRect/>
                     </a:stretch>
@@ -488,7 +944,7 @@
                     <pic:cNvPicPr/>
                   </pic:nvPicPr>
                   <pic:blipFill>
-                    <a:blip r:embed="rId8"/>
+                    <a:blip r:embed="rId9"/>
                     <a:stretch>
                       <a:fillRect/>
                     </a:stretch>
@@ -540,7 +996,23 @@
           <w:b/>
           <w:bCs/>
         </w:rPr>
-        <w:t xml:space="preserve">4.Adım: Veri Şifreleme (TDE - </w:t>
+        <w:t>4.Adım: Veri Şifreleme (</w:t>
+      </w:r>
+      <w:proofErr w:type="gramStart"/>
+      <w:r>
+        <w:rPr>
+          <w:b/>
+          <w:bCs/>
+        </w:rPr>
+        <w:t>TDE -</w:t>
+      </w:r>
+      <w:proofErr w:type="gramEnd"/>
+      <w:r>
+        <w:rPr>
+          <w:b/>
+          <w:bCs/>
+        </w:rPr>
+        <w:t xml:space="preserve"> </w:t>
       </w:r>
       <w:proofErr w:type="spellStart"/>
       <w:r>
@@ -604,7 +1076,15 @@
       </w:r>
       <w:proofErr w:type="spellEnd"/>
       <w:r>
-        <w:t>) yöntemi uygulanmıştır. TC Kimlik bilgileri AES-256 algoritması ile disk üzerinde okunamaz hale getirilmiştir.</w:t>
+        <w:t xml:space="preserve">) yöntemi uygulanmıştır. </w:t>
+      </w:r>
+      <w:proofErr w:type="gramStart"/>
+      <w:r>
+        <w:t>TC</w:t>
+      </w:r>
+      <w:proofErr w:type="gramEnd"/>
+      <w:r>
+        <w:t xml:space="preserve"> Kimlik bilgileri AES-256 algoritması ile disk üzerinde okunamaz hale getirilmiştir.</w:t>
       </w:r>
     </w:p>
     <w:p>
@@ -613,7 +1093,7 @@
           <w:noProof/>
         </w:rPr>
         <w:drawing>
-          <wp:inline distT="0" distB="0" distL="0" distR="0" wp14:anchorId="210B39B6" wp14:editId="779133AD">
+          <wp:inline distT="0" distB="0" distL="0" distR="0" wp14:anchorId="210B39B6" wp14:editId="092AF14E">
             <wp:extent cx="3741420" cy="3271569"/>
             <wp:effectExtent l="0" t="0" r="0" b="5080"/>
             <wp:docPr id="1755980660" name="Resim 1" descr="metin, ekran görüntüsü, sayı, numara, yazı tipi içeren bir resim&#10;&#10;Yapay zeka tarafından oluşturulmuş içerik yanlış olabilir."/>
@@ -628,7 +1108,7 @@
                     <pic:cNvPicPr/>
                   </pic:nvPicPr>
                   <pic:blipFill rotWithShape="1">
-                    <a:blip r:embed="rId9"/>
+                    <a:blip r:embed="rId10"/>
                     <a:srcRect t="29057"/>
                     <a:stretch>
                       <a:fillRect/>
@@ -637,7 +1117,7 @@
                   <pic:spPr bwMode="auto">
                     <a:xfrm>
                       <a:off x="0" y="0"/>
-                      <a:ext cx="3748386" cy="3277660"/>
+                      <a:ext cx="3741420" cy="3271569"/>
                     </a:xfrm>
                     <a:prstGeom prst="rect">
                       <a:avLst/>
@@ -713,13 +1193,7 @@
       </w:r>
       <w:proofErr w:type="spellEnd"/>
       <w:r>
-        <w:t xml:space="preserve"> direnci test edilmiştir. Dinamik SQL yapısının ' OR 1=1 -- gibi girdilerle tüm verileri sızdırabildiği (Zafiyet anı) gözlemlenmiştir.</w:t>
-      </w:r>
-      <w:r>
-        <w:t xml:space="preserve"> </w:t>
-      </w:r>
-      <w:r>
-        <w:t>Bu açığı kapatmak için Parametreli Sorgu (</w:t>
+        <w:t xml:space="preserve"> direnci test edilmiştir. Dinamik SQL yapısının ' OR 1=1 -- gibi girdilerle tüm verileri sızdırabildiği (Zafiyet anı) gözlemlenmiştir. Bu açığı kapatmak için Parametreli Sorgu (</w:t>
       </w:r>
       <w:proofErr w:type="spellStart"/>
       <w:r>
@@ -732,6 +1206,9 @@
     </w:p>
     <w:p>
       <w:r>
+        <w:rPr>
+          <w:noProof/>
+        </w:rPr>
         <w:drawing>
           <wp:inline distT="0" distB="0" distL="0" distR="0" wp14:anchorId="58BABEDE" wp14:editId="21CEA637">
             <wp:extent cx="4145639" cy="1402202"/>
@@ -748,7 +1225,7 @@
                     <pic:cNvPicPr/>
                   </pic:nvPicPr>
                   <pic:blipFill>
-                    <a:blip r:embed="rId10"/>
+                    <a:blip r:embed="rId11"/>
                     <a:stretch>
                       <a:fillRect/>
                     </a:stretch>
@@ -809,8 +1286,13 @@
     </w:p>
     <w:p>
       <w:proofErr w:type="spellStart"/>
-      <w:r>
-        <w:t>sys.xp_readerrorlog</w:t>
+      <w:proofErr w:type="gramStart"/>
+      <w:r>
+        <w:t>sys.xp</w:t>
+      </w:r>
+      <w:proofErr w:type="gramEnd"/>
+      <w:r>
+        <w:t>_readerrorlog</w:t>
       </w:r>
       <w:proofErr w:type="spellEnd"/>
       <w:r>
@@ -843,6 +1325,9 @@
     </w:p>
     <w:p>
       <w:r>
+        <w:rPr>
+          <w:noProof/>
+        </w:rPr>
         <w:drawing>
           <wp:inline distT="0" distB="0" distL="0" distR="0" wp14:anchorId="7ED7E2E3" wp14:editId="0D7254C4">
             <wp:extent cx="4823878" cy="4778154"/>
@@ -859,7 +1344,7 @@
                     <pic:cNvPicPr/>
                   </pic:nvPicPr>
                   <pic:blipFill>
-                    <a:blip r:embed="rId11"/>
+                    <a:blip r:embed="rId12"/>
                     <a:stretch>
                       <a:fillRect/>
                     </a:stretch>
@@ -2155,6 +2640,17 @@
       <w:rFonts w:ascii="Times New Roman" w:hAnsi="Times New Roman" w:cs="Times New Roman"/>
     </w:rPr>
   </w:style>
+  <w:style w:type="character" w:styleId="Kpr">
+    <w:name w:val="Hyperlink"/>
+    <w:basedOn w:val="VarsaylanParagrafYazTipi"/>
+    <w:uiPriority w:val="99"/>
+    <w:unhideWhenUsed/>
+    <w:rsid w:val="001819CC"/>
+    <w:rPr>
+      <w:color w:val="467886" w:themeColor="hyperlink"/>
+      <w:u w:val="single"/>
+    </w:rPr>
+  </w:style>
 </w:styles>
 </file>
 

</xml_diff>

<commit_message>
Proje 3: Kapak sayfası eklendi ve rapor son kontrolle güncellendi
</commit_message>
<xml_diff>
--- a/BLM4522_Proje3/Rapor.docx
+++ b/BLM4522_Proje3/Rapor.docx
@@ -103,7 +103,7 @@
                     </pic:cNvPicPr>
                   </pic:nvPicPr>
                   <pic:blipFill>
-                    <a:blip r:embed="rId5" cstate="print"/>
+                    <a:blip r:embed="rId7" cstate="print"/>
                     <a:srcRect/>
                     <a:stretch>
                       <a:fillRect/>
@@ -324,6 +324,7 @@
         <w:pStyle w:val="Balk1"/>
         <w:jc w:val="center"/>
       </w:pPr>
+      <w:bookmarkStart w:id="1" w:name="_Toc227625620"/>
       <w:r>
         <w:rPr>
           <w:rFonts w:asciiTheme="minorHAnsi" w:eastAsiaTheme="minorHAnsi" w:hAnsiTheme="minorHAnsi" w:cs="Arial"/>
@@ -400,12 +401,710 @@
         </w:rPr>
         <w:t>-Sistemleri-Projeleri</w:t>
       </w:r>
+      <w:bookmarkEnd w:id="1"/>
     </w:p>
     <w:bookmarkEnd w:id="0"/>
     <w:p/>
     <w:p/>
     <w:p/>
     <w:p/>
+    <w:p/>
+    <w:sdt>
+      <w:sdtPr>
+        <w:rPr>
+          <w:rFonts w:eastAsia="Calibri"/>
+          <w:b w:val="0"/>
+          <w:bCs w:val="0"/>
+          <w:color w:val="auto"/>
+          <w:szCs w:val="22"/>
+          <w:lang w:val="tr-TR" w:eastAsia="en-US"/>
+        </w:rPr>
+        <w:id w:val="-1039284817"/>
+        <w:docPartObj>
+          <w:docPartGallery w:val="Table of Contents"/>
+          <w:docPartUnique/>
+        </w:docPartObj>
+      </w:sdtPr>
+      <w:sdtEndPr>
+        <w:rPr>
+          <w:rFonts w:asciiTheme="minorHAnsi" w:eastAsiaTheme="minorHAnsi" w:hAnsiTheme="minorHAnsi" w:cstheme="minorBidi"/>
+          <w:kern w:val="2"/>
+          <w:szCs w:val="24"/>
+          <w14:ligatures w14:val="standardContextual"/>
+        </w:rPr>
+      </w:sdtEndPr>
+      <w:sdtContent>
+        <w:p>
+          <w:pPr>
+            <w:pStyle w:val="TBal"/>
+            <w:ind w:firstLine="0"/>
+            <w:jc w:val="left"/>
+          </w:pPr>
+        </w:p>
+        <w:p>
+          <w:pPr>
+            <w:pStyle w:val="T1"/>
+            <w:tabs>
+              <w:tab w:val="right" w:leader="dot" w:pos="9062"/>
+            </w:tabs>
+            <w:rPr>
+              <w:rFonts w:asciiTheme="minorHAnsi" w:eastAsiaTheme="minorEastAsia" w:hAnsiTheme="minorHAnsi" w:cstheme="minorBidi"/>
+              <w:b w:val="0"/>
+              <w:noProof/>
+              <w:kern w:val="2"/>
+              <w:szCs w:val="24"/>
+              <w:lang w:val="tr-TR" w:eastAsia="tr-TR"/>
+              <w14:ligatures w14:val="standardContextual"/>
+            </w:rPr>
+          </w:pPr>
+          <w:r>
+            <w:fldChar w:fldCharType="begin"/>
+          </w:r>
+          <w:r>
+            <w:instrText xml:space="preserve"> TOC \o "1-3" \h \z \u </w:instrText>
+          </w:r>
+          <w:r>
+            <w:fldChar w:fldCharType="separate"/>
+          </w:r>
+          <w:hyperlink w:anchor="_Toc227625620" w:history="1">
+            <w:r>
+              <w:rPr>
+                <w:rStyle w:val="Kpr"/>
+                <w:rFonts w:eastAsiaTheme="minorHAnsi"/>
+                <w:noProof/>
+              </w:rPr>
+              <w:t>https://github.com/senemarici/BLM4522--Ag-Tabanli-Paralel-Dagitim-Sistemleri-Projeleri</w:t>
+            </w:r>
+            <w:r>
+              <w:rPr>
+                <w:noProof/>
+                <w:webHidden/>
+              </w:rPr>
+              <w:tab/>
+            </w:r>
+            <w:r>
+              <w:rPr>
+                <w:noProof/>
+                <w:webHidden/>
+              </w:rPr>
+              <w:fldChar w:fldCharType="begin"/>
+            </w:r>
+            <w:r>
+              <w:rPr>
+                <w:noProof/>
+                <w:webHidden/>
+              </w:rPr>
+              <w:instrText xml:space="preserve"> PAGEREF _Toc227625620 \h </w:instrText>
+            </w:r>
+            <w:r>
+              <w:rPr>
+                <w:noProof/>
+                <w:webHidden/>
+              </w:rPr>
+            </w:r>
+            <w:r>
+              <w:rPr>
+                <w:noProof/>
+                <w:webHidden/>
+              </w:rPr>
+              <w:fldChar w:fldCharType="separate"/>
+            </w:r>
+            <w:r>
+              <w:rPr>
+                <w:noProof/>
+                <w:webHidden/>
+              </w:rPr>
+              <w:t>1</w:t>
+            </w:r>
+            <w:r>
+              <w:rPr>
+                <w:noProof/>
+                <w:webHidden/>
+              </w:rPr>
+              <w:fldChar w:fldCharType="end"/>
+            </w:r>
+          </w:hyperlink>
+        </w:p>
+        <w:p>
+          <w:pPr>
+            <w:pStyle w:val="T1"/>
+            <w:tabs>
+              <w:tab w:val="right" w:leader="dot" w:pos="9062"/>
+            </w:tabs>
+            <w:rPr>
+              <w:rFonts w:asciiTheme="minorHAnsi" w:eastAsiaTheme="minorEastAsia" w:hAnsiTheme="minorHAnsi" w:cstheme="minorBidi"/>
+              <w:b w:val="0"/>
+              <w:noProof/>
+              <w:kern w:val="2"/>
+              <w:szCs w:val="24"/>
+              <w:lang w:val="tr-TR" w:eastAsia="tr-TR"/>
+              <w14:ligatures w14:val="standardContextual"/>
+            </w:rPr>
+          </w:pPr>
+          <w:hyperlink w:anchor="_Toc227625621" w:history="1">
+            <w:r>
+              <w:rPr>
+                <w:rStyle w:val="Kpr"/>
+                <w:bCs/>
+                <w:noProof/>
+              </w:rPr>
+              <w:t>Proje 3: Veritabanı Güvenliği ve Erişim Kontrolü</w:t>
+            </w:r>
+            <w:r>
+              <w:rPr>
+                <w:noProof/>
+                <w:webHidden/>
+              </w:rPr>
+              <w:tab/>
+            </w:r>
+            <w:r>
+              <w:rPr>
+                <w:noProof/>
+                <w:webHidden/>
+              </w:rPr>
+              <w:fldChar w:fldCharType="begin"/>
+            </w:r>
+            <w:r>
+              <w:rPr>
+                <w:noProof/>
+                <w:webHidden/>
+              </w:rPr>
+              <w:instrText xml:space="preserve"> PAGEREF _Toc227625621 \h </w:instrText>
+            </w:r>
+            <w:r>
+              <w:rPr>
+                <w:noProof/>
+                <w:webHidden/>
+              </w:rPr>
+            </w:r>
+            <w:r>
+              <w:rPr>
+                <w:noProof/>
+                <w:webHidden/>
+              </w:rPr>
+              <w:fldChar w:fldCharType="separate"/>
+            </w:r>
+            <w:r>
+              <w:rPr>
+                <w:noProof/>
+                <w:webHidden/>
+              </w:rPr>
+              <w:t>3</w:t>
+            </w:r>
+            <w:r>
+              <w:rPr>
+                <w:noProof/>
+                <w:webHidden/>
+              </w:rPr>
+              <w:fldChar w:fldCharType="end"/>
+            </w:r>
+          </w:hyperlink>
+        </w:p>
+        <w:p>
+          <w:pPr>
+            <w:pStyle w:val="T3"/>
+            <w:tabs>
+              <w:tab w:val="right" w:leader="dot" w:pos="9062"/>
+            </w:tabs>
+            <w:rPr>
+              <w:rFonts w:eastAsiaTheme="minorEastAsia"/>
+              <w:noProof/>
+              <w:lang w:eastAsia="tr-TR"/>
+            </w:rPr>
+          </w:pPr>
+          <w:hyperlink w:anchor="_Toc227625622" w:history="1">
+            <w:r>
+              <w:rPr>
+                <w:rStyle w:val="Kpr"/>
+                <w:noProof/>
+              </w:rPr>
+              <w:t>1.adım: Veri Seti Hazırlığı</w:t>
+            </w:r>
+            <w:r>
+              <w:rPr>
+                <w:noProof/>
+                <w:webHidden/>
+              </w:rPr>
+              <w:tab/>
+            </w:r>
+            <w:r>
+              <w:rPr>
+                <w:noProof/>
+                <w:webHidden/>
+              </w:rPr>
+              <w:fldChar w:fldCharType="begin"/>
+            </w:r>
+            <w:r>
+              <w:rPr>
+                <w:noProof/>
+                <w:webHidden/>
+              </w:rPr>
+              <w:instrText xml:space="preserve"> PAGEREF _Toc227625622 \h </w:instrText>
+            </w:r>
+            <w:r>
+              <w:rPr>
+                <w:noProof/>
+                <w:webHidden/>
+              </w:rPr>
+            </w:r>
+            <w:r>
+              <w:rPr>
+                <w:noProof/>
+                <w:webHidden/>
+              </w:rPr>
+              <w:fldChar w:fldCharType="separate"/>
+            </w:r>
+            <w:r>
+              <w:rPr>
+                <w:noProof/>
+                <w:webHidden/>
+              </w:rPr>
+              <w:t>3</w:t>
+            </w:r>
+            <w:r>
+              <w:rPr>
+                <w:noProof/>
+                <w:webHidden/>
+              </w:rPr>
+              <w:fldChar w:fldCharType="end"/>
+            </w:r>
+          </w:hyperlink>
+        </w:p>
+        <w:p>
+          <w:pPr>
+            <w:pStyle w:val="T3"/>
+            <w:tabs>
+              <w:tab w:val="right" w:leader="dot" w:pos="9062"/>
+            </w:tabs>
+            <w:rPr>
+              <w:rFonts w:eastAsiaTheme="minorEastAsia"/>
+              <w:noProof/>
+              <w:lang w:eastAsia="tr-TR"/>
+            </w:rPr>
+          </w:pPr>
+          <w:hyperlink w:anchor="_Toc227625623" w:history="1">
+            <w:r>
+              <w:rPr>
+                <w:rStyle w:val="Kpr"/>
+                <w:noProof/>
+              </w:rPr>
+              <w:t>2.Adım: Erişim Yönetimi (Authentication)</w:t>
+            </w:r>
+            <w:r>
+              <w:rPr>
+                <w:noProof/>
+                <w:webHidden/>
+              </w:rPr>
+              <w:tab/>
+            </w:r>
+            <w:r>
+              <w:rPr>
+                <w:noProof/>
+                <w:webHidden/>
+              </w:rPr>
+              <w:fldChar w:fldCharType="begin"/>
+            </w:r>
+            <w:r>
+              <w:rPr>
+                <w:noProof/>
+                <w:webHidden/>
+              </w:rPr>
+              <w:instrText xml:space="preserve"> PAGEREF _Toc227625623 \h </w:instrText>
+            </w:r>
+            <w:r>
+              <w:rPr>
+                <w:noProof/>
+                <w:webHidden/>
+              </w:rPr>
+            </w:r>
+            <w:r>
+              <w:rPr>
+                <w:noProof/>
+                <w:webHidden/>
+              </w:rPr>
+              <w:fldChar w:fldCharType="separate"/>
+            </w:r>
+            <w:r>
+              <w:rPr>
+                <w:noProof/>
+                <w:webHidden/>
+              </w:rPr>
+              <w:t>3</w:t>
+            </w:r>
+            <w:r>
+              <w:rPr>
+                <w:noProof/>
+                <w:webHidden/>
+              </w:rPr>
+              <w:fldChar w:fldCharType="end"/>
+            </w:r>
+          </w:hyperlink>
+        </w:p>
+        <w:p>
+          <w:pPr>
+            <w:pStyle w:val="T3"/>
+            <w:tabs>
+              <w:tab w:val="right" w:leader="dot" w:pos="9062"/>
+            </w:tabs>
+            <w:rPr>
+              <w:rFonts w:eastAsiaTheme="minorEastAsia"/>
+              <w:noProof/>
+              <w:lang w:eastAsia="tr-TR"/>
+            </w:rPr>
+          </w:pPr>
+          <w:hyperlink w:anchor="_Toc227625624" w:history="1">
+            <w:r>
+              <w:rPr>
+                <w:rStyle w:val="Kpr"/>
+                <w:noProof/>
+              </w:rPr>
+              <w:t>3.Adım: Yetkilendirme ve Kısıtlı Erişim (Authorization)</w:t>
+            </w:r>
+            <w:r>
+              <w:rPr>
+                <w:noProof/>
+                <w:webHidden/>
+              </w:rPr>
+              <w:tab/>
+            </w:r>
+            <w:r>
+              <w:rPr>
+                <w:noProof/>
+                <w:webHidden/>
+              </w:rPr>
+              <w:fldChar w:fldCharType="begin"/>
+            </w:r>
+            <w:r>
+              <w:rPr>
+                <w:noProof/>
+                <w:webHidden/>
+              </w:rPr>
+              <w:instrText xml:space="preserve"> PAGEREF _Toc227625624 \h </w:instrText>
+            </w:r>
+            <w:r>
+              <w:rPr>
+                <w:noProof/>
+                <w:webHidden/>
+              </w:rPr>
+            </w:r>
+            <w:r>
+              <w:rPr>
+                <w:noProof/>
+                <w:webHidden/>
+              </w:rPr>
+              <w:fldChar w:fldCharType="separate"/>
+            </w:r>
+            <w:r>
+              <w:rPr>
+                <w:noProof/>
+                <w:webHidden/>
+              </w:rPr>
+              <w:t>4</w:t>
+            </w:r>
+            <w:r>
+              <w:rPr>
+                <w:noProof/>
+                <w:webHidden/>
+              </w:rPr>
+              <w:fldChar w:fldCharType="end"/>
+            </w:r>
+          </w:hyperlink>
+        </w:p>
+        <w:p>
+          <w:pPr>
+            <w:pStyle w:val="T3"/>
+            <w:tabs>
+              <w:tab w:val="right" w:leader="dot" w:pos="9062"/>
+            </w:tabs>
+            <w:rPr>
+              <w:rFonts w:eastAsiaTheme="minorEastAsia"/>
+              <w:noProof/>
+              <w:lang w:eastAsia="tr-TR"/>
+            </w:rPr>
+          </w:pPr>
+          <w:hyperlink w:anchor="_Toc227625625" w:history="1">
+            <w:r>
+              <w:rPr>
+                <w:rStyle w:val="Kpr"/>
+                <w:noProof/>
+              </w:rPr>
+              <w:t>4.Adım: Veri Şifreleme (TDE - Transparent Data Encryption)</w:t>
+            </w:r>
+            <w:r>
+              <w:rPr>
+                <w:noProof/>
+                <w:webHidden/>
+              </w:rPr>
+              <w:tab/>
+            </w:r>
+            <w:r>
+              <w:rPr>
+                <w:noProof/>
+                <w:webHidden/>
+              </w:rPr>
+              <w:fldChar w:fldCharType="begin"/>
+            </w:r>
+            <w:r>
+              <w:rPr>
+                <w:noProof/>
+                <w:webHidden/>
+              </w:rPr>
+              <w:instrText xml:space="preserve"> PAGEREF _Toc227625625 \h </w:instrText>
+            </w:r>
+            <w:r>
+              <w:rPr>
+                <w:noProof/>
+                <w:webHidden/>
+              </w:rPr>
+            </w:r>
+            <w:r>
+              <w:rPr>
+                <w:noProof/>
+                <w:webHidden/>
+              </w:rPr>
+              <w:fldChar w:fldCharType="separate"/>
+            </w:r>
+            <w:r>
+              <w:rPr>
+                <w:noProof/>
+                <w:webHidden/>
+              </w:rPr>
+              <w:t>6</w:t>
+            </w:r>
+            <w:r>
+              <w:rPr>
+                <w:noProof/>
+                <w:webHidden/>
+              </w:rPr>
+              <w:fldChar w:fldCharType="end"/>
+            </w:r>
+          </w:hyperlink>
+        </w:p>
+        <w:p>
+          <w:pPr>
+            <w:pStyle w:val="T3"/>
+            <w:tabs>
+              <w:tab w:val="right" w:leader="dot" w:pos="9062"/>
+            </w:tabs>
+            <w:rPr>
+              <w:rFonts w:eastAsiaTheme="minorEastAsia"/>
+              <w:noProof/>
+              <w:lang w:eastAsia="tr-TR"/>
+            </w:rPr>
+          </w:pPr>
+          <w:hyperlink w:anchor="_Toc227625626" w:history="1">
+            <w:r>
+              <w:rPr>
+                <w:rStyle w:val="Kpr"/>
+                <w:noProof/>
+              </w:rPr>
+              <w:t>5. Adım: SQL Injection Testleri ve Korunma</w:t>
+            </w:r>
+            <w:r>
+              <w:rPr>
+                <w:noProof/>
+                <w:webHidden/>
+              </w:rPr>
+              <w:tab/>
+            </w:r>
+            <w:r>
+              <w:rPr>
+                <w:noProof/>
+                <w:webHidden/>
+              </w:rPr>
+              <w:fldChar w:fldCharType="begin"/>
+            </w:r>
+            <w:r>
+              <w:rPr>
+                <w:noProof/>
+                <w:webHidden/>
+              </w:rPr>
+              <w:instrText xml:space="preserve"> PAGEREF _Toc227625626 \h </w:instrText>
+            </w:r>
+            <w:r>
+              <w:rPr>
+                <w:noProof/>
+                <w:webHidden/>
+              </w:rPr>
+            </w:r>
+            <w:r>
+              <w:rPr>
+                <w:noProof/>
+                <w:webHidden/>
+              </w:rPr>
+              <w:fldChar w:fldCharType="separate"/>
+            </w:r>
+            <w:r>
+              <w:rPr>
+                <w:noProof/>
+                <w:webHidden/>
+              </w:rPr>
+              <w:t>6</w:t>
+            </w:r>
+            <w:r>
+              <w:rPr>
+                <w:noProof/>
+                <w:webHidden/>
+              </w:rPr>
+              <w:fldChar w:fldCharType="end"/>
+            </w:r>
+          </w:hyperlink>
+        </w:p>
+        <w:p>
+          <w:pPr>
+            <w:pStyle w:val="T3"/>
+            <w:tabs>
+              <w:tab w:val="right" w:leader="dot" w:pos="9062"/>
+            </w:tabs>
+            <w:rPr>
+              <w:rFonts w:eastAsiaTheme="minorEastAsia"/>
+              <w:noProof/>
+              <w:lang w:eastAsia="tr-TR"/>
+            </w:rPr>
+          </w:pPr>
+          <w:hyperlink w:anchor="_Toc227625627" w:history="1">
+            <w:r>
+              <w:rPr>
+                <w:rStyle w:val="Kpr"/>
+                <w:noProof/>
+              </w:rPr>
+              <w:t>6. Adım: Audit Log (Kullanıcı Aktivite Takibi)</w:t>
+            </w:r>
+            <w:r>
+              <w:rPr>
+                <w:noProof/>
+                <w:webHidden/>
+              </w:rPr>
+              <w:tab/>
+            </w:r>
+            <w:r>
+              <w:rPr>
+                <w:noProof/>
+                <w:webHidden/>
+              </w:rPr>
+              <w:fldChar w:fldCharType="begin"/>
+            </w:r>
+            <w:r>
+              <w:rPr>
+                <w:noProof/>
+                <w:webHidden/>
+              </w:rPr>
+              <w:instrText xml:space="preserve"> PAGEREF _Toc227625627 \h </w:instrText>
+            </w:r>
+            <w:r>
+              <w:rPr>
+                <w:noProof/>
+                <w:webHidden/>
+              </w:rPr>
+            </w:r>
+            <w:r>
+              <w:rPr>
+                <w:noProof/>
+                <w:webHidden/>
+              </w:rPr>
+              <w:fldChar w:fldCharType="separate"/>
+            </w:r>
+            <w:r>
+              <w:rPr>
+                <w:noProof/>
+                <w:webHidden/>
+              </w:rPr>
+              <w:t>7</w:t>
+            </w:r>
+            <w:r>
+              <w:rPr>
+                <w:noProof/>
+                <w:webHidden/>
+              </w:rPr>
+              <w:fldChar w:fldCharType="end"/>
+            </w:r>
+          </w:hyperlink>
+        </w:p>
+        <w:p>
+          <w:pPr>
+            <w:pStyle w:val="T3"/>
+            <w:tabs>
+              <w:tab w:val="right" w:leader="dot" w:pos="9062"/>
+            </w:tabs>
+            <w:rPr>
+              <w:rFonts w:eastAsiaTheme="minorEastAsia"/>
+              <w:noProof/>
+              <w:lang w:eastAsia="tr-TR"/>
+            </w:rPr>
+          </w:pPr>
+          <w:hyperlink w:anchor="_Toc227625628" w:history="1">
+            <w:r>
+              <w:rPr>
+                <w:rStyle w:val="Kpr"/>
+                <w:noProof/>
+              </w:rPr>
+              <w:t>Sonuç ve Değerlendirme</w:t>
+            </w:r>
+            <w:r>
+              <w:rPr>
+                <w:noProof/>
+                <w:webHidden/>
+              </w:rPr>
+              <w:tab/>
+            </w:r>
+            <w:r>
+              <w:rPr>
+                <w:noProof/>
+                <w:webHidden/>
+              </w:rPr>
+              <w:fldChar w:fldCharType="begin"/>
+            </w:r>
+            <w:r>
+              <w:rPr>
+                <w:noProof/>
+                <w:webHidden/>
+              </w:rPr>
+              <w:instrText xml:space="preserve"> PAGEREF _Toc227625628 \h </w:instrText>
+            </w:r>
+            <w:r>
+              <w:rPr>
+                <w:noProof/>
+                <w:webHidden/>
+              </w:rPr>
+            </w:r>
+            <w:r>
+              <w:rPr>
+                <w:noProof/>
+                <w:webHidden/>
+              </w:rPr>
+              <w:fldChar w:fldCharType="separate"/>
+            </w:r>
+            <w:r>
+              <w:rPr>
+                <w:noProof/>
+                <w:webHidden/>
+              </w:rPr>
+              <w:t>7</w:t>
+            </w:r>
+            <w:r>
+              <w:rPr>
+                <w:noProof/>
+                <w:webHidden/>
+              </w:rPr>
+              <w:fldChar w:fldCharType="end"/>
+            </w:r>
+          </w:hyperlink>
+        </w:p>
+        <w:p>
+          <w:pPr>
+            <w:spacing w:after="200" w:line="276" w:lineRule="auto"/>
+            <w:jc w:val="both"/>
+          </w:pPr>
+          <w:r>
+            <w:rPr>
+              <w:b/>
+              <w:bCs/>
+            </w:rPr>
+            <w:fldChar w:fldCharType="end"/>
+          </w:r>
+        </w:p>
+      </w:sdtContent>
+    </w:sdt>
     <w:p>
       <w:pPr>
         <w:pStyle w:val="Balk1"/>
@@ -416,11 +1115,43 @@
           <w:color w:val="000000" w:themeColor="text1"/>
         </w:rPr>
       </w:pPr>
-      <w:r>
-        <w:rPr>
+    </w:p>
+    <w:p>
+      <w:pPr>
+        <w:rPr>
+          <w:rFonts w:asciiTheme="majorHAnsi" w:eastAsiaTheme="majorEastAsia" w:hAnsiTheme="majorHAnsi" w:cstheme="majorBidi"/>
           <w:b/>
           <w:bCs/>
           <w:color w:val="000000" w:themeColor="text1"/>
+          <w:sz w:val="40"/>
+          <w:szCs w:val="40"/>
+        </w:rPr>
+      </w:pPr>
+      <w:r>
+        <w:rPr>
+          <w:b/>
+          <w:bCs/>
+          <w:color w:val="000000" w:themeColor="text1"/>
+        </w:rPr>
+        <w:br w:type="page"/>
+      </w:r>
+    </w:p>
+    <w:p>
+      <w:pPr>
+        <w:pStyle w:val="Balk1"/>
+        <w:jc w:val="center"/>
+        <w:rPr>
+          <w:b/>
+          <w:bCs/>
+          <w:color w:val="000000" w:themeColor="text1"/>
+        </w:rPr>
+      </w:pPr>
+      <w:bookmarkStart w:id="2" w:name="_Toc227625621"/>
+      <w:r>
+        <w:rPr>
+          <w:b/>
+          <w:bCs/>
+          <w:color w:val="000000" w:themeColor="text1"/>
         </w:rPr>
         <w:lastRenderedPageBreak/>
         <w:t xml:space="preserve">Proje 3: </w:t>
@@ -443,6 +1174,7 @@
         </w:rPr>
         <w:t xml:space="preserve"> Güvenliği ve Erişim Kontrolü</w:t>
       </w:r>
+      <w:bookmarkEnd w:id="2"/>
     </w:p>
     <w:p/>
     <w:p>
@@ -455,18 +1187,13 @@
     </w:p>
     <w:p>
       <w:pPr>
-        <w:rPr>
-          <w:b/>
-          <w:bCs/>
-        </w:rPr>
-      </w:pPr>
-      <w:r>
-        <w:rPr>
-          <w:b/>
-          <w:bCs/>
-        </w:rPr>
+        <w:pStyle w:val="Balk3"/>
+      </w:pPr>
+      <w:bookmarkStart w:id="3" w:name="_Toc227625622"/>
+      <w:r>
         <w:t>1.adım: Veri Seti Hazırlığı</w:t>
       </w:r>
+      <w:bookmarkEnd w:id="3"/>
     </w:p>
     <w:p>
       <w:r>
@@ -510,34 +1237,21 @@
     </w:p>
     <w:p>
       <w:pPr>
-        <w:rPr>
-          <w:b/>
-          <w:bCs/>
-        </w:rPr>
-      </w:pPr>
-      <w:r>
-        <w:rPr>
-          <w:b/>
-          <w:bCs/>
-        </w:rPr>
+        <w:pStyle w:val="Balk3"/>
+      </w:pPr>
+      <w:bookmarkStart w:id="4" w:name="_Toc227625623"/>
+      <w:r>
         <w:t>2.Adım: Erişim Yönetimi (</w:t>
       </w:r>
       <w:proofErr w:type="spellStart"/>
       <w:r>
-        <w:rPr>
-          <w:b/>
-          <w:bCs/>
-        </w:rPr>
         <w:t>Authentication</w:t>
       </w:r>
       <w:proofErr w:type="spellEnd"/>
       <w:r>
-        <w:rPr>
-          <w:b/>
-          <w:bCs/>
-        </w:rPr>
         <w:t>)</w:t>
       </w:r>
+      <w:bookmarkEnd w:id="4"/>
     </w:p>
     <w:p>
       <w:r>
@@ -598,7 +1312,7 @@
                     <pic:cNvPicPr/>
                   </pic:nvPicPr>
                   <pic:blipFill>
-                    <a:blip r:embed="rId6"/>
+                    <a:blip r:embed="rId8"/>
                     <a:stretch>
                       <a:fillRect/>
                     </a:stretch>
@@ -628,34 +1342,21 @@
     </w:p>
     <w:p>
       <w:pPr>
-        <w:rPr>
-          <w:b/>
-          <w:bCs/>
-        </w:rPr>
-      </w:pPr>
-      <w:r>
-        <w:rPr>
-          <w:b/>
-          <w:bCs/>
-        </w:rPr>
+        <w:pStyle w:val="Balk3"/>
+      </w:pPr>
+      <w:bookmarkStart w:id="5" w:name="_Toc227625624"/>
+      <w:r>
         <w:t>3.Adım: Yetkilendirme ve Kısıtlı Erişim (</w:t>
       </w:r>
       <w:proofErr w:type="spellStart"/>
       <w:r>
-        <w:rPr>
-          <w:b/>
-          <w:bCs/>
-        </w:rPr>
         <w:t>Authorization</w:t>
       </w:r>
       <w:proofErr w:type="spellEnd"/>
       <w:r>
-        <w:rPr>
-          <w:b/>
-          <w:bCs/>
-        </w:rPr>
         <w:t>)</w:t>
       </w:r>
+      <w:bookmarkEnd w:id="5"/>
     </w:p>
     <w:p>
       <w:r>
@@ -688,34 +1389,19 @@
     </w:p>
     <w:p>
       <w:pPr>
-        <w:rPr>
-          <w:b/>
-          <w:bCs/>
-        </w:rPr>
+        <w:pStyle w:val="Balk4"/>
       </w:pPr>
       <w:proofErr w:type="spellStart"/>
       <w:proofErr w:type="gramStart"/>
       <w:r>
-        <w:rPr>
-          <w:b/>
-          <w:bCs/>
-        </w:rPr>
         <w:t>A.</w:t>
       </w:r>
       <w:r>
-        <w:rPr>
-          <w:b/>
-          <w:bCs/>
-        </w:rPr>
         <w:t>Yetkili</w:t>
       </w:r>
       <w:proofErr w:type="spellEnd"/>
       <w:proofErr w:type="gramEnd"/>
       <w:r>
-        <w:rPr>
-          <w:b/>
-          <w:bCs/>
-        </w:rPr>
         <w:t xml:space="preserve"> Erişim (Başarı Senaryosu):</w:t>
       </w:r>
     </w:p>
@@ -751,7 +1437,7 @@
                     <pic:cNvPicPr/>
                   </pic:nvPicPr>
                   <pic:blipFill>
-                    <a:blip r:embed="rId7"/>
+                    <a:blip r:embed="rId9"/>
                     <a:stretch>
                       <a:fillRect/>
                     </a:stretch>
@@ -798,16 +1484,9 @@
     </w:p>
     <w:p>
       <w:pPr>
-        <w:rPr>
-          <w:b/>
-          <w:bCs/>
-        </w:rPr>
-      </w:pPr>
-      <w:r>
-        <w:rPr>
-          <w:b/>
-          <w:bCs/>
-        </w:rPr>
+        <w:pStyle w:val="Balk4"/>
+      </w:pPr>
+      <w:r>
         <w:lastRenderedPageBreak/>
         <w:t>B. Yetkisiz Erişim (Güvenlik Engeli):</w:t>
       </w:r>
@@ -866,7 +1545,7 @@
                     <pic:cNvPicPr/>
                   </pic:nvPicPr>
                   <pic:blipFill>
-                    <a:blip r:embed="rId8"/>
+                    <a:blip r:embed="rId10"/>
                     <a:stretch>
                       <a:fillRect/>
                     </a:stretch>
@@ -897,16 +1576,9 @@
     </w:p>
     <w:p>
       <w:pPr>
-        <w:rPr>
-          <w:b/>
-          <w:bCs/>
-        </w:rPr>
-      </w:pPr>
-      <w:r>
-        <w:rPr>
-          <w:b/>
-          <w:bCs/>
-        </w:rPr>
+        <w:pStyle w:val="Balk4"/>
+      </w:pPr>
+      <w:r>
         <w:t>C. Veri Bütünlüğünün Korunması (Update Engeli):</w:t>
       </w:r>
     </w:p>
@@ -944,7 +1616,7 @@
                     <pic:cNvPicPr/>
                   </pic:nvPicPr>
                   <pic:blipFill>
-                    <a:blip r:embed="rId9"/>
+                    <a:blip r:embed="rId11"/>
                     <a:stretch>
                       <a:fillRect/>
                     </a:stretch>
@@ -986,66 +1658,37 @@
     </w:p>
     <w:p>
       <w:pPr>
-        <w:rPr>
-          <w:b/>
-          <w:bCs/>
-        </w:rPr>
-      </w:pPr>
-      <w:r>
-        <w:rPr>
-          <w:b/>
-          <w:bCs/>
-        </w:rPr>
+        <w:pStyle w:val="Balk3"/>
+      </w:pPr>
+      <w:bookmarkStart w:id="6" w:name="_Toc227625625"/>
+      <w:r>
         <w:t>4.Adım: Veri Şifreleme (</w:t>
       </w:r>
       <w:proofErr w:type="gramStart"/>
       <w:r>
-        <w:rPr>
-          <w:b/>
-          <w:bCs/>
-        </w:rPr>
         <w:t>TDE -</w:t>
       </w:r>
       <w:proofErr w:type="gramEnd"/>
       <w:r>
-        <w:rPr>
-          <w:b/>
-          <w:bCs/>
-        </w:rPr>
         <w:t xml:space="preserve"> </w:t>
       </w:r>
       <w:proofErr w:type="spellStart"/>
       <w:r>
-        <w:rPr>
-          <w:b/>
-          <w:bCs/>
-        </w:rPr>
         <w:t>Transparent</w:t>
       </w:r>
       <w:proofErr w:type="spellEnd"/>
       <w:r>
-        <w:rPr>
-          <w:b/>
-          <w:bCs/>
-        </w:rPr>
         <w:t xml:space="preserve"> Data </w:t>
       </w:r>
       <w:proofErr w:type="spellStart"/>
       <w:r>
-        <w:rPr>
-          <w:b/>
-          <w:bCs/>
-        </w:rPr>
         <w:t>Encryption</w:t>
       </w:r>
       <w:proofErr w:type="spellEnd"/>
       <w:r>
-        <w:rPr>
-          <w:b/>
-          <w:bCs/>
-        </w:rPr>
         <w:t>)</w:t>
       </w:r>
+      <w:bookmarkEnd w:id="6"/>
     </w:p>
     <w:p>
       <w:r>
@@ -1108,7 +1751,7 @@
                     <pic:cNvPicPr/>
                   </pic:nvPicPr>
                   <pic:blipFill rotWithShape="1">
-                    <a:blip r:embed="rId10"/>
+                    <a:blip r:embed="rId12"/>
                     <a:srcRect t="29057"/>
                     <a:stretch>
                       <a:fillRect/>
@@ -1146,34 +1789,21 @@
     </w:p>
     <w:p>
       <w:pPr>
-        <w:rPr>
-          <w:b/>
-          <w:bCs/>
-        </w:rPr>
-      </w:pPr>
-      <w:r>
-        <w:rPr>
-          <w:b/>
-          <w:bCs/>
-        </w:rPr>
+        <w:pStyle w:val="Balk3"/>
+      </w:pPr>
+      <w:bookmarkStart w:id="7" w:name="_Toc227625626"/>
+      <w:r>
         <w:t xml:space="preserve">5. Adım: SQL </w:t>
       </w:r>
       <w:proofErr w:type="spellStart"/>
       <w:r>
-        <w:rPr>
-          <w:b/>
-          <w:bCs/>
-        </w:rPr>
         <w:t>Injection</w:t>
       </w:r>
       <w:proofErr w:type="spellEnd"/>
       <w:r>
-        <w:rPr>
-          <w:b/>
-          <w:bCs/>
-        </w:rPr>
         <w:t xml:space="preserve"> Testleri ve Korunma</w:t>
       </w:r>
+      <w:bookmarkEnd w:id="7"/>
     </w:p>
     <w:p>
       <w:r>
@@ -1225,7 +1855,7 @@
                     <pic:cNvPicPr/>
                   </pic:nvPicPr>
                   <pic:blipFill>
-                    <a:blip r:embed="rId11"/>
+                    <a:blip r:embed="rId13"/>
                     <a:stretch>
                       <a:fillRect/>
                     </a:stretch>
@@ -1255,34 +1885,21 @@
     </w:p>
     <w:p>
       <w:pPr>
-        <w:rPr>
-          <w:b/>
-          <w:bCs/>
-        </w:rPr>
-      </w:pPr>
-      <w:r>
-        <w:rPr>
-          <w:b/>
-          <w:bCs/>
-        </w:rPr>
+        <w:pStyle w:val="Balk3"/>
+      </w:pPr>
+      <w:bookmarkStart w:id="8" w:name="_Toc227625627"/>
+      <w:r>
         <w:t xml:space="preserve">6. Adım: </w:t>
       </w:r>
       <w:proofErr w:type="spellStart"/>
       <w:r>
-        <w:rPr>
-          <w:b/>
-          <w:bCs/>
-        </w:rPr>
         <w:t>Audit</w:t>
       </w:r>
       <w:proofErr w:type="spellEnd"/>
       <w:r>
-        <w:rPr>
-          <w:b/>
-          <w:bCs/>
-        </w:rPr>
         <w:t xml:space="preserve"> Log (Kullanıcı Aktivite Takibi)</w:t>
       </w:r>
+      <w:bookmarkEnd w:id="8"/>
     </w:p>
     <w:p>
       <w:proofErr w:type="spellStart"/>
@@ -1344,7 +1961,7 @@
                     <pic:cNvPicPr/>
                   </pic:nvPicPr>
                   <pic:blipFill>
-                    <a:blip r:embed="rId12"/>
+                    <a:blip r:embed="rId14"/>
                     <a:stretch>
                       <a:fillRect/>
                     </a:stretch>
@@ -1365,6 +1982,52 @@
         </w:drawing>
       </w:r>
     </w:p>
+    <w:p/>
+    <w:p>
+      <w:pPr>
+        <w:pStyle w:val="Balk3"/>
+      </w:pPr>
+      <w:bookmarkStart w:id="9" w:name="_Toc227625628"/>
+      <w:r>
+        <w:t>Sonuç ve Değerlendirme</w:t>
+      </w:r>
+      <w:bookmarkEnd w:id="9"/>
+    </w:p>
+    <w:p>
+      <w:r>
+        <w:t xml:space="preserve">Bu projede </w:t>
+      </w:r>
+      <w:proofErr w:type="spellStart"/>
+      <w:r>
+        <w:t>veritabanı</w:t>
+      </w:r>
+      <w:proofErr w:type="spellEnd"/>
+      <w:r>
+        <w:t xml:space="preserve"> güvenliği için temel adımlar uygulanmış ve test edilmiştir. Kimlik doğrulama ve yetkilendirme ile kullanıcıların sadece izin verilen verilere erişmesi sağlanmış, hassas veriler şifrelenerek korunmuştur. Ayrıca SQL </w:t>
+      </w:r>
+      <w:proofErr w:type="spellStart"/>
+      <w:r>
+        <w:t>Injection</w:t>
+      </w:r>
+      <w:proofErr w:type="spellEnd"/>
+      <w:r>
+        <w:t xml:space="preserve"> saldırılarına karşı sistem test edilmiş ve parametreli sorgular kullanılarak güvenlik açığı giderilmiştir.</w:t>
+      </w:r>
+    </w:p>
+    <w:p>
+      <w:r>
+        <w:t xml:space="preserve">Genel olarak, </w:t>
+      </w:r>
+      <w:proofErr w:type="spellStart"/>
+      <w:r>
+        <w:t>veritabanı</w:t>
+      </w:r>
+      <w:proofErr w:type="spellEnd"/>
+      <w:r>
+        <w:t xml:space="preserve"> güvenliğinin tek bir yöntemle değil, birden fazla güvenlik önleminin birlikte uygulanmasıyla sağlanabileceği görülmüştür.</w:t>
+      </w:r>
+    </w:p>
+    <w:p/>
     <w:sectPr>
       <w:pgSz w:w="11906" w:h="16838"/>
       <w:pgMar w:top="1417" w:right="1417" w:bottom="1417" w:left="1417" w:header="708" w:footer="708" w:gutter="0"/>
@@ -1373,6 +2036,56 @@
     </w:sectPr>
   </w:body>
 </w:document>
+</file>
+
+<file path=word/endnotes.xml><?xml version="1.0" encoding="utf-8"?>
+<w:endnotes xmlns:wpc="http://schemas.microsoft.com/office/word/2010/wordprocessingCanvas" xmlns:cx="http://schemas.microsoft.com/office/drawing/2014/chartex" xmlns:cx1="http://schemas.microsoft.com/office/drawing/2015/9/8/chartex" xmlns:cx2="http://schemas.microsoft.com/office/drawing/2015/10/21/chartex" xmlns:cx3="http://schemas.microsoft.com/office/drawing/2016/5/9/chartex" xmlns:cx4="http://schemas.microsoft.com/office/drawing/2016/5/10/chartex" xmlns:cx5="http://schemas.microsoft.com/office/drawing/2016/5/11/chartex" xmlns:cx6="http://schemas.microsoft.com/office/drawing/2016/5/12/chartex" xmlns:cx7="http://schemas.microsoft.com/office/drawing/2016/5/13/chartex" xmlns:cx8="http://schemas.microsoft.com/office/drawing/2016/5/14/chartex" xmlns:mc="http://schemas.openxmlformats.org/markup-compatibility/2006" xmlns:aink="http://schemas.microsoft.com/office/drawing/2016/ink" xmlns:am3d="http://schemas.microsoft.com/office/drawing/2017/model3d" xmlns:o="urn:schemas-microsoft-com:office:office" xmlns:oel="http://schemas.microsoft.com/office/2019/extlst" xmlns:r="http://schemas.openxmlformats.org/officeDocument/2006/relationships" xmlns:m="http://schemas.openxmlformats.org/officeDocument/2006/math" xmlns:v="urn:schemas-microsoft-com:vml" xmlns:wp14="http://schemas.microsoft.com/office/word/2010/wordprocessingDrawing" xmlns:wp="http://schemas.openxmlformats.org/drawingml/2006/wordprocessingDrawing" xmlns:w10="urn:schemas-microsoft-com:office:word" xmlns:w="http://schemas.openxmlformats.org/wordprocessingml/2006/main" xmlns:w14="http://schemas.microsoft.com/office/word/2010/wordml" xmlns:w15="http://schemas.microsoft.com/office/word/2012/wordml" xmlns:w16cex="http://schemas.microsoft.com/office/word/2018/wordml/cex" xmlns:w16cid="http://schemas.microsoft.com/office/word/2016/wordml/cid" xmlns:w16="http://schemas.microsoft.com/office/word/2018/wordml" xmlns:w16du="http://schemas.microsoft.com/office/word/2023/wordml/word16du" xmlns:w16sdtdh="http://schemas.microsoft.com/office/word/2020/wordml/sdtdatahash" xmlns:w16sdtfl="http://schemas.microsoft.com/office/word/2024/wordml/sdtformatlock" xmlns:w16se="http://schemas.microsoft.com/office/word/2015/wordml/symex" xmlns:wpg="http://schemas.microsoft.com/office/word/2010/wordprocessingGroup" xmlns:wpi="http://schemas.microsoft.com/office/word/2010/wordprocessingInk" xmlns:wne="http://schemas.microsoft.com/office/word/2006/wordml" xmlns:wps="http://schemas.microsoft.com/office/word/2010/wordprocessingShape" mc:Ignorable="w14 w15 w16se w16cid w16 w16cex w16sdtdh w16sdtfl w16du wp14">
+  <w:endnote w:type="separator" w:id="-1">
+    <w:p>
+      <w:pPr>
+        <w:spacing w:after="0" w:line="240" w:lineRule="auto"/>
+      </w:pPr>
+      <w:r>
+        <w:separator/>
+      </w:r>
+    </w:p>
+  </w:endnote>
+  <w:endnote w:type="continuationSeparator" w:id="0">
+    <w:p>
+      <w:pPr>
+        <w:spacing w:after="0" w:line="240" w:lineRule="auto"/>
+      </w:pPr>
+      <w:r>
+        <w:continuationSeparator/>
+      </w:r>
+    </w:p>
+  </w:endnote>
+</w:endnotes>
+</file>
+
+<file path=word/footnotes.xml><?xml version="1.0" encoding="utf-8"?>
+<w:footnotes xmlns:wpc="http://schemas.microsoft.com/office/word/2010/wordprocessingCanvas" xmlns:cx="http://schemas.microsoft.com/office/drawing/2014/chartex" xmlns:cx1="http://schemas.microsoft.com/office/drawing/2015/9/8/chartex" xmlns:cx2="http://schemas.microsoft.com/office/drawing/2015/10/21/chartex" xmlns:cx3="http://schemas.microsoft.com/office/drawing/2016/5/9/chartex" xmlns:cx4="http://schemas.microsoft.com/office/drawing/2016/5/10/chartex" xmlns:cx5="http://schemas.microsoft.com/office/drawing/2016/5/11/chartex" xmlns:cx6="http://schemas.microsoft.com/office/drawing/2016/5/12/chartex" xmlns:cx7="http://schemas.microsoft.com/office/drawing/2016/5/13/chartex" xmlns:cx8="http://schemas.microsoft.com/office/drawing/2016/5/14/chartex" xmlns:mc="http://schemas.openxmlformats.org/markup-compatibility/2006" xmlns:aink="http://schemas.microsoft.com/office/drawing/2016/ink" xmlns:am3d="http://schemas.microsoft.com/office/drawing/2017/model3d" xmlns:o="urn:schemas-microsoft-com:office:office" xmlns:oel="http://schemas.microsoft.com/office/2019/extlst" xmlns:r="http://schemas.openxmlformats.org/officeDocument/2006/relationships" xmlns:m="http://schemas.openxmlformats.org/officeDocument/2006/math" xmlns:v="urn:schemas-microsoft-com:vml" xmlns:wp14="http://schemas.microsoft.com/office/word/2010/wordprocessingDrawing" xmlns:wp="http://schemas.openxmlformats.org/drawingml/2006/wordprocessingDrawing" xmlns:w10="urn:schemas-microsoft-com:office:word" xmlns:w="http://schemas.openxmlformats.org/wordprocessingml/2006/main" xmlns:w14="http://schemas.microsoft.com/office/word/2010/wordml" xmlns:w15="http://schemas.microsoft.com/office/word/2012/wordml" xmlns:w16cex="http://schemas.microsoft.com/office/word/2018/wordml/cex" xmlns:w16cid="http://schemas.microsoft.com/office/word/2016/wordml/cid" xmlns:w16="http://schemas.microsoft.com/office/word/2018/wordml" xmlns:w16du="http://schemas.microsoft.com/office/word/2023/wordml/word16du" xmlns:w16sdtdh="http://schemas.microsoft.com/office/word/2020/wordml/sdtdatahash" xmlns:w16sdtfl="http://schemas.microsoft.com/office/word/2024/wordml/sdtformatlock" xmlns:w16se="http://schemas.microsoft.com/office/word/2015/wordml/symex" xmlns:wpg="http://schemas.microsoft.com/office/word/2010/wordprocessingGroup" xmlns:wpi="http://schemas.microsoft.com/office/word/2010/wordprocessingInk" xmlns:wne="http://schemas.microsoft.com/office/word/2006/wordml" xmlns:wps="http://schemas.microsoft.com/office/word/2010/wordprocessingShape" mc:Ignorable="w14 w15 w16se w16cid w16 w16cex w16sdtdh w16sdtfl w16du wp14">
+  <w:footnote w:type="separator" w:id="-1">
+    <w:p>
+      <w:pPr>
+        <w:spacing w:after="0" w:line="240" w:lineRule="auto"/>
+      </w:pPr>
+      <w:r>
+        <w:separator/>
+      </w:r>
+    </w:p>
+  </w:footnote>
+  <w:footnote w:type="continuationSeparator" w:id="0">
+    <w:p>
+      <w:pPr>
+        <w:spacing w:after="0" w:line="240" w:lineRule="auto"/>
+      </w:pPr>
+      <w:r>
+        <w:continuationSeparator/>
+      </w:r>
+    </w:p>
+  </w:footnote>
+</w:footnotes>
 </file>
 
 <file path=word/numbering.xml><?xml version="1.0" encoding="utf-8"?>
@@ -1752,8 +2465,8 @@
     <w:lsdException w:name="index 7" w:semiHidden="1" w:unhideWhenUsed="1"/>
     <w:lsdException w:name="index 8" w:semiHidden="1" w:unhideWhenUsed="1"/>
     <w:lsdException w:name="index 9" w:semiHidden="1" w:unhideWhenUsed="1"/>
-    <w:lsdException w:name="toc 1" w:semiHidden="1" w:uiPriority="39" w:unhideWhenUsed="1"/>
-    <w:lsdException w:name="toc 2" w:semiHidden="1" w:uiPriority="39" w:unhideWhenUsed="1"/>
+    <w:lsdException w:name="toc 1" w:semiHidden="1" w:uiPriority="39" w:unhideWhenUsed="1" w:qFormat="1"/>
+    <w:lsdException w:name="toc 2" w:semiHidden="1" w:uiPriority="39" w:unhideWhenUsed="1" w:qFormat="1"/>
     <w:lsdException w:name="toc 3" w:semiHidden="1" w:uiPriority="39" w:unhideWhenUsed="1"/>
     <w:lsdException w:name="toc 4" w:semiHidden="1" w:uiPriority="39" w:unhideWhenUsed="1"/>
     <w:lsdException w:name="toc 5" w:semiHidden="1" w:uiPriority="39" w:unhideWhenUsed="1"/>
@@ -2141,7 +2854,6 @@
     <w:next w:val="Normal"/>
     <w:link w:val="Balk2Char"/>
     <w:uiPriority w:val="9"/>
-    <w:semiHidden/>
     <w:unhideWhenUsed/>
     <w:qFormat/>
     <w:rsid w:val="004D25B0"/>
@@ -2164,10 +2876,9 @@
     <w:next w:val="Normal"/>
     <w:link w:val="Balk3Char"/>
     <w:uiPriority w:val="9"/>
-    <w:semiHidden/>
     <w:unhideWhenUsed/>
     <w:qFormat/>
-    <w:rsid w:val="004D25B0"/>
+    <w:rsid w:val="001101BF"/>
     <w:pPr>
       <w:keepNext/>
       <w:keepLines/>
@@ -2176,7 +2887,7 @@
     </w:pPr>
     <w:rPr>
       <w:rFonts w:eastAsiaTheme="majorEastAsia" w:cstheme="majorBidi"/>
-      <w:color w:val="0F4761" w:themeColor="accent1" w:themeShade="BF"/>
+      <w:color w:val="000000" w:themeColor="text1"/>
       <w:sz w:val="28"/>
       <w:szCs w:val="28"/>
     </w:rPr>
@@ -2187,10 +2898,9 @@
     <w:next w:val="Normal"/>
     <w:link w:val="Balk4Char"/>
     <w:uiPriority w:val="9"/>
-    <w:semiHidden/>
     <w:unhideWhenUsed/>
     <w:qFormat/>
-    <w:rsid w:val="004D25B0"/>
+    <w:rsid w:val="001101BF"/>
     <w:pPr>
       <w:keepNext/>
       <w:keepLines/>
@@ -2201,7 +2911,7 @@
       <w:rFonts w:eastAsiaTheme="majorEastAsia" w:cstheme="majorBidi"/>
       <w:i/>
       <w:iCs/>
-      <w:color w:val="0F4761" w:themeColor="accent1" w:themeShade="BF"/>
+      <w:color w:val="000000" w:themeColor="text1"/>
     </w:rPr>
   </w:style>
   <w:style w:type="paragraph" w:styleId="Balk5">
@@ -2371,11 +3081,10 @@
     <w:basedOn w:val="VarsaylanParagrafYazTipi"/>
     <w:link w:val="Balk3"/>
     <w:uiPriority w:val="9"/>
-    <w:semiHidden/>
-    <w:rsid w:val="004D25B0"/>
+    <w:rsid w:val="001101BF"/>
     <w:rPr>
       <w:rFonts w:eastAsiaTheme="majorEastAsia" w:cstheme="majorBidi"/>
-      <w:color w:val="0F4761" w:themeColor="accent1" w:themeShade="BF"/>
+      <w:color w:val="000000" w:themeColor="text1"/>
       <w:sz w:val="28"/>
       <w:szCs w:val="28"/>
     </w:rPr>
@@ -2385,13 +3094,12 @@
     <w:basedOn w:val="VarsaylanParagrafYazTipi"/>
     <w:link w:val="Balk4"/>
     <w:uiPriority w:val="9"/>
-    <w:semiHidden/>
-    <w:rsid w:val="004D25B0"/>
+    <w:rsid w:val="001101BF"/>
     <w:rPr>
       <w:rFonts w:eastAsiaTheme="majorEastAsia" w:cstheme="majorBidi"/>
       <w:i/>
       <w:iCs/>
-      <w:color w:val="0F4761" w:themeColor="accent1" w:themeShade="BF"/>
+      <w:color w:val="000000" w:themeColor="text1"/>
     </w:rPr>
   </w:style>
   <w:style w:type="character" w:customStyle="1" w:styleId="Balk5Char">
@@ -2650,6 +3358,109 @@
       <w:color w:val="467886" w:themeColor="hyperlink"/>
       <w:u w:val="single"/>
     </w:rPr>
+  </w:style>
+  <w:style w:type="paragraph" w:styleId="TBal">
+    <w:name w:val="TOC Heading"/>
+    <w:basedOn w:val="Balk1"/>
+    <w:next w:val="Normal"/>
+    <w:uiPriority w:val="39"/>
+    <w:unhideWhenUsed/>
+    <w:qFormat/>
+    <w:rsid w:val="001101BF"/>
+    <w:pPr>
+      <w:spacing w:before="480" w:after="0" w:line="276" w:lineRule="auto"/>
+      <w:ind w:left="432" w:hanging="432"/>
+      <w:jc w:val="center"/>
+      <w:outlineLvl w:val="9"/>
+    </w:pPr>
+    <w:rPr>
+      <w:rFonts w:ascii="Arial" w:eastAsia="MS Gothic" w:hAnsi="Arial" w:cs="Times New Roman"/>
+      <w:b/>
+      <w:bCs/>
+      <w:color w:val="000000" w:themeColor="text1"/>
+      <w:kern w:val="0"/>
+      <w:sz w:val="24"/>
+      <w:szCs w:val="28"/>
+      <w:lang w:val="en-US" w:eastAsia="ja-JP"/>
+      <w14:ligatures w14:val="none"/>
+    </w:rPr>
+  </w:style>
+  <w:style w:type="paragraph" w:styleId="T2">
+    <w:name w:val="toc 2"/>
+    <w:basedOn w:val="Normal"/>
+    <w:next w:val="Normal"/>
+    <w:link w:val="T2Char"/>
+    <w:autoRedefine/>
+    <w:uiPriority w:val="39"/>
+    <w:unhideWhenUsed/>
+    <w:qFormat/>
+    <w:rsid w:val="001101BF"/>
+    <w:pPr>
+      <w:tabs>
+        <w:tab w:val="right" w:leader="dot" w:pos="9071"/>
+      </w:tabs>
+      <w:spacing w:after="100" w:line="276" w:lineRule="auto"/>
+      <w:ind w:left="216"/>
+      <w:jc w:val="both"/>
+    </w:pPr>
+    <w:rPr>
+      <w:rFonts w:ascii="Arial" w:eastAsia="MS Mincho" w:hAnsi="Arial" w:cs="Arial"/>
+      <w:b/>
+      <w:kern w:val="0"/>
+      <w:u w:val="single"/>
+      <w:lang w:eastAsia="ja-JP"/>
+      <w14:ligatures w14:val="none"/>
+    </w:rPr>
+  </w:style>
+  <w:style w:type="paragraph" w:styleId="T1">
+    <w:name w:val="toc 1"/>
+    <w:basedOn w:val="Normal"/>
+    <w:next w:val="Normal"/>
+    <w:autoRedefine/>
+    <w:uiPriority w:val="39"/>
+    <w:unhideWhenUsed/>
+    <w:qFormat/>
+    <w:rsid w:val="001101BF"/>
+    <w:pPr>
+      <w:spacing w:after="100" w:line="276" w:lineRule="auto"/>
+      <w:jc w:val="both"/>
+    </w:pPr>
+    <w:rPr>
+      <w:rFonts w:ascii="Arial" w:eastAsia="MS Mincho" w:hAnsi="Arial" w:cs="Arial"/>
+      <w:b/>
+      <w:kern w:val="0"/>
+      <w:szCs w:val="22"/>
+      <w:lang w:val="en-US" w:eastAsia="ja-JP"/>
+      <w14:ligatures w14:val="none"/>
+    </w:rPr>
+  </w:style>
+  <w:style w:type="character" w:customStyle="1" w:styleId="T2Char">
+    <w:name w:val="İÇT 2 Char"/>
+    <w:basedOn w:val="VarsaylanParagrafYazTipi"/>
+    <w:link w:val="T2"/>
+    <w:uiPriority w:val="39"/>
+    <w:rsid w:val="001101BF"/>
+    <w:rPr>
+      <w:rFonts w:ascii="Arial" w:eastAsia="MS Mincho" w:hAnsi="Arial" w:cs="Arial"/>
+      <w:b/>
+      <w:kern w:val="0"/>
+      <w:u w:val="single"/>
+      <w:lang w:eastAsia="ja-JP"/>
+      <w14:ligatures w14:val="none"/>
+    </w:rPr>
+  </w:style>
+  <w:style w:type="paragraph" w:styleId="T3">
+    <w:name w:val="toc 3"/>
+    <w:basedOn w:val="Normal"/>
+    <w:next w:val="Normal"/>
+    <w:autoRedefine/>
+    <w:uiPriority w:val="39"/>
+    <w:unhideWhenUsed/>
+    <w:rsid w:val="003B309D"/>
+    <w:pPr>
+      <w:spacing w:after="100"/>
+      <w:ind w:left="480"/>
+    </w:pPr>
   </w:style>
 </w:styles>
 </file>

</xml_diff>